<commit_message>
primeira versão da documentação
</commit_message>
<xml_diff>
--- a/Documentos/Documentação .docx
+++ b/Documentos/Documentação .docx
@@ -116,12 +116,12 @@
                 <wp:extent cx="193066" cy="199281"/>
                 <wp:effectExtent b="0" l="0" r="0" t="0"/>
                 <wp:wrapNone/>
-                <wp:docPr id="18" name="image4.png"/>
+                <wp:docPr id="18" name="image9.png"/>
                 <a:graphic>
                   <a:graphicData uri="http://schemas.openxmlformats.org/drawingml/2006/picture">
                     <pic:pic>
                       <pic:nvPicPr>
-                        <pic:cNvPr id="0" name="image4.png"/>
+                        <pic:cNvPr id="0" name="image9.png"/>
                         <pic:cNvPicPr preferRelativeResize="0"/>
                       </pic:nvPicPr>
                       <pic:blipFill>
@@ -164,12 +164,12 @@
             <wp:extent cx="8567336" cy="13559193"/>
             <wp:effectExtent b="0" l="0" r="0" t="0"/>
             <wp:wrapSquare wrapText="bothSides" distB="152400" distT="152400" distL="152400" distR="152400"/>
-            <wp:docPr id="24" name="image5.png"/>
+            <wp:docPr id="24" name="image3.png"/>
             <a:graphic>
               <a:graphicData uri="http://schemas.openxmlformats.org/drawingml/2006/picture">
                 <pic:pic>
                   <pic:nvPicPr>
-                    <pic:cNvPr id="0" name="image5.png"/>
+                    <pic:cNvPr id="0" name="image3.png"/>
                     <pic:cNvPicPr preferRelativeResize="0"/>
                   </pic:nvPicPr>
                   <pic:blipFill>
@@ -210,12 +210,12 @@
             <wp:extent cx="2804546" cy="1204657"/>
             <wp:effectExtent b="0" l="0" r="0" t="0"/>
             <wp:wrapSquare wrapText="bothSides" distB="152400" distT="152400" distL="152400" distR="152400"/>
-            <wp:docPr id="27" name="image8.png"/>
+            <wp:docPr id="27" name="image7.png"/>
             <a:graphic>
               <a:graphicData uri="http://schemas.openxmlformats.org/drawingml/2006/picture">
                 <pic:pic>
                   <pic:nvPicPr>
-                    <pic:cNvPr id="0" name="image8.png"/>
+                    <pic:cNvPr id="0" name="image7.png"/>
                     <pic:cNvPicPr preferRelativeResize="0"/>
                   </pic:nvPicPr>
                   <pic:blipFill>
@@ -357,12 +357,12 @@
                 <wp:extent cx="3931928" cy="1659082"/>
                 <wp:effectExtent b="0" l="0" r="0" t="0"/>
                 <wp:wrapTopAndBottom distB="152400" distT="152400"/>
-                <wp:docPr id="17" name="image3.png"/>
+                <wp:docPr id="17" name="image8.png"/>
                 <a:graphic>
                   <a:graphicData uri="http://schemas.openxmlformats.org/drawingml/2006/picture">
                     <pic:pic>
                       <pic:nvPicPr>
-                        <pic:cNvPr id="0" name="image3.png"/>
+                        <pic:cNvPr id="0" name="image8.png"/>
                         <pic:cNvPicPr preferRelativeResize="0"/>
                       </pic:nvPicPr>
                       <pic:blipFill>
@@ -404,12 +404,12 @@
             <wp:extent cx="865287" cy="472641"/>
             <wp:effectExtent b="0" l="0" r="0" t="0"/>
             <wp:wrapSquare wrapText="bothSides" distB="152400" distT="152400" distL="152400" distR="152400"/>
-            <wp:docPr id="26" name="image6.png"/>
+            <wp:docPr id="26" name="image2.png"/>
             <a:graphic>
               <a:graphicData uri="http://schemas.openxmlformats.org/drawingml/2006/picture">
                 <pic:pic>
                   <pic:nvPicPr>
-                    <pic:cNvPr id="0" name="image6.png"/>
+                    <pic:cNvPr id="0" name="image2.png"/>
                     <pic:cNvPicPr preferRelativeResize="0"/>
                   </pic:nvPicPr>
                   <pic:blipFill>
@@ -449,12 +449,12 @@
             <wp:extent cx="1867967" cy="1320786"/>
             <wp:effectExtent b="0" l="0" r="0" t="0"/>
             <wp:wrapSquare wrapText="bothSides" distB="152400" distT="152400" distL="152400" distR="152400"/>
-            <wp:docPr id="21" name="image2.png"/>
+            <wp:docPr id="21" name="image4.png"/>
             <a:graphic>
               <a:graphicData uri="http://schemas.openxmlformats.org/drawingml/2006/picture">
                 <pic:pic>
                   <pic:nvPicPr>
-                    <pic:cNvPr id="0" name="image2.png"/>
+                    <pic:cNvPr id="0" name="image4.png"/>
                     <pic:cNvPicPr preferRelativeResize="0"/>
                   </pic:nvPicPr>
                   <pic:blipFill>
@@ -1755,8 +1755,11 @@
             </w:pPr>
             <w:r>
               <w:rPr>
+                <w:sz w:val="20"/>
+                <w:szCs w:val="20"/>
                 <w:rtl w:val="0"/>
               </w:rPr>
+              <w:t xml:space="preserve">14/08/2022</w:t>
             </w:r>
           </w:p>
         </w:tc>
@@ -1817,8 +1820,11 @@
             </w:pPr>
             <w:r>
               <w:rPr>
+                <w:sz w:val="20"/>
+                <w:szCs w:val="20"/>
                 <w:rtl w:val="0"/>
               </w:rPr>
+              <w:t xml:space="preserve">Sarah Ribeiro</w:t>
             </w:r>
           </w:p>
         </w:tc>
@@ -1879,8 +1885,11 @@
             </w:pPr>
             <w:r>
               <w:rPr>
+                <w:sz w:val="20"/>
+                <w:szCs w:val="20"/>
                 <w:rtl w:val="0"/>
               </w:rPr>
+              <w:t xml:space="preserve">1.3</w:t>
             </w:r>
           </w:p>
         </w:tc>
@@ -1941,8 +1950,11 @@
             </w:pPr>
             <w:r>
               <w:rPr>
+                <w:sz w:val="20"/>
+                <w:szCs w:val="20"/>
                 <w:rtl w:val="0"/>
               </w:rPr>
+              <w:t xml:space="preserve">Atualização da seção 4.2</w:t>
             </w:r>
           </w:p>
         </w:tc>
@@ -6100,12 +6112,12 @@
           <wp:inline distB="114300" distT="114300" distL="114300" distR="114300">
             <wp:extent cx="4319588" cy="2617670"/>
             <wp:effectExtent b="0" l="0" r="0" t="0"/>
-            <wp:docPr id="22" name="image7.jpg"/>
+            <wp:docPr id="22" name="image5.jpg"/>
             <a:graphic>
               <a:graphicData uri="http://schemas.openxmlformats.org/drawingml/2006/picture">
                 <pic:pic>
                   <pic:nvPicPr>
-                    <pic:cNvPr id="0" name="image7.jpg"/>
+                    <pic:cNvPr id="0" name="image5.jpg"/>
                     <pic:cNvPicPr preferRelativeResize="0"/>
                   </pic:nvPicPr>
                   <pic:blipFill>
@@ -6964,7 +6976,7 @@
               <w:widowControl w:val="0"/>
               <w:numPr>
                 <w:ilvl w:val="0"/>
-                <w:numId w:val="6"/>
+                <w:numId w:val="7"/>
               </w:numPr>
               <w:spacing w:after="0" w:line="240" w:lineRule="auto"/>
               <w:ind w:left="720" w:hanging="360"/>
@@ -6988,7 +7000,7 @@
               <w:widowControl w:val="0"/>
               <w:numPr>
                 <w:ilvl w:val="0"/>
-                <w:numId w:val="6"/>
+                <w:numId w:val="7"/>
               </w:numPr>
               <w:spacing w:after="0" w:line="240" w:lineRule="auto"/>
               <w:ind w:left="720" w:hanging="360"/>
@@ -7012,7 +7024,7 @@
               <w:widowControl w:val="0"/>
               <w:numPr>
                 <w:ilvl w:val="0"/>
-                <w:numId w:val="6"/>
+                <w:numId w:val="7"/>
               </w:numPr>
               <w:spacing w:after="0" w:line="240" w:lineRule="auto"/>
               <w:ind w:left="720" w:hanging="360"/>
@@ -7036,7 +7048,7 @@
               <w:widowControl w:val="0"/>
               <w:numPr>
                 <w:ilvl w:val="0"/>
-                <w:numId w:val="6"/>
+                <w:numId w:val="7"/>
               </w:numPr>
               <w:spacing w:after="0" w:line="240" w:lineRule="auto"/>
               <w:ind w:left="720" w:hanging="360"/>
@@ -7797,12 +7809,12 @@
           <wp:inline distB="114300" distT="114300" distL="114300" distR="114300">
             <wp:extent cx="6119820" cy="3441700"/>
             <wp:effectExtent b="0" l="0" r="0" t="0"/>
-            <wp:docPr id="19" name="image9.jpg"/>
+            <wp:docPr id="19" name="image6.jpg"/>
             <a:graphic>
               <a:graphicData uri="http://schemas.openxmlformats.org/drawingml/2006/picture">
                 <pic:pic>
                   <pic:nvPicPr>
-                    <pic:cNvPr id="0" name="image9.jpg"/>
+                    <pic:cNvPr id="0" name="image6.jpg"/>
                     <pic:cNvPicPr preferRelativeResize="0"/>
                   </pic:nvPicPr>
                   <pic:blipFill>
@@ -8581,7 +8593,7 @@
       <w:pPr>
         <w:numPr>
           <w:ilvl w:val="0"/>
-          <w:numId w:val="5"/>
+          <w:numId w:val="6"/>
         </w:numPr>
         <w:tabs>
           <w:tab w:val="left" w:pos="708"/>
@@ -8617,9 +8629,18 @@
       </w:pPr>
       <w:r>
         <w:rPr>
-          <w:rtl w:val="0"/>
-        </w:rPr>
-        <w:t xml:space="preserve">Descreva os dados a serem utilizados (disponibilizados pelo cliente e outros se tiverem sido incluídos), detalhando a fonte, o formato (CSV, XLSX, banco de dados, etc.), o conteúdo e o tamanho (linhas, colunas e shape do dataframe ‘comando shape na biblioteca’).</w:t>
+          <w:b w:val="1"/>
+          <w:color w:val="3c0a49"/>
+          <w:rtl w:val="0"/>
+        </w:rPr>
+        <w:t xml:space="preserve">Descreva os dados a serem utilizados (disponibilizados pelo cliente e outros se tiverem sido incluídos), detalhando a fonte, o formato (CSV, XLSX, banco de dados, etc.), o conteúdo e o tamanho (linhas, colunas e shape do dataframe ‘comando shape na biblioteca’)</w:t>
+      </w:r>
+      <w:r>
+        <w:rPr>
+          <w:b w:val="1"/>
+          <w:rtl w:val="0"/>
+        </w:rPr>
+        <w:t xml:space="preserve">.</w:t>
       </w:r>
     </w:p>
     <w:p>
@@ -8717,7 +8738,7 @@
         <w:rPr>
           <w:rtl w:val="0"/>
         </w:rPr>
-        <w:t xml:space="preserve">Taxa de aceitação dos pedidos;</w:t>
+        <w:t xml:space="preserve">Taxa de aceitação dos pedidos pelo entregador (identificado pelo seu ID);</w:t>
       </w:r>
     </w:p>
     <w:p>
@@ -8826,7 +8847,7 @@
         <w:rPr>
           <w:rtl w:val="0"/>
         </w:rPr>
-        <w:t xml:space="preserve">A receita de cada entregador;</w:t>
+        <w:t xml:space="preserve">A receita de cada entregador (possui a informação de ganhos e gorjetas);</w:t>
       </w:r>
     </w:p>
     <w:p>
@@ -8933,7 +8954,7 @@
         <w:rPr>
           <w:rtl w:val="0"/>
         </w:rPr>
-        <w:t xml:space="preserve">Os pedidos que foram concluídos e cancelados;</w:t>
+        <w:t xml:space="preserve">Os pedidos que foram concluídos e cancelados ;</w:t>
       </w:r>
     </w:p>
     <w:p>
@@ -9157,7 +9178,7 @@
         <w:rPr>
           <w:rtl w:val="0"/>
         </w:rPr>
-        <w:t xml:space="preserve">As informações gerais de cada entregador;</w:t>
+        <w:t xml:space="preserve">As informações gerais de cada entregador (nome, cidade, data de nascimento, etc);</w:t>
       </w:r>
     </w:p>
     <w:p>
@@ -9278,7 +9299,7 @@
         <w:rPr>
           <w:rtl w:val="0"/>
         </w:rPr>
-        <w:t xml:space="preserve">Retorno de um produto uma vez que a ordem foi cancelada</w:t>
+        <w:t xml:space="preserve">O retorno de um produto uma vez que a ordem foi cancelada</w:t>
       </w:r>
     </w:p>
     <w:p>
@@ -9830,7 +9851,7 @@
       <w:pPr>
         <w:numPr>
           <w:ilvl w:val="1"/>
-          <w:numId w:val="5"/>
+          <w:numId w:val="6"/>
         </w:numPr>
         <w:tabs>
           <w:tab w:val="left" w:pos="708"/>
@@ -9862,228 +9883,60 @@
         </w:tabs>
         <w:spacing w:after="200" w:line="276" w:lineRule="auto"/>
         <w:ind w:left="1440" w:hanging="360"/>
+        <w:rPr>
+          <w:i w:val="1"/>
+          <w:color w:val="3c0a49"/>
+        </w:rPr>
+      </w:pPr>
+      <w:r>
+        <w:rPr>
+          <w:i w:val="1"/>
+          <w:color w:val="3c0a49"/>
+          <w:rtl w:val="0"/>
+        </w:rPr>
+        <w:t xml:space="preserve">(Se houver mais de um conjunto de dados, descrição de como serão agregados/mesclados.)</w:t>
+      </w:r>
+    </w:p>
+    <w:p>
+      <w:pPr>
+        <w:tabs>
+          <w:tab w:val="left" w:pos="708"/>
+          <w:tab w:val="left" w:pos="1416"/>
+          <w:tab w:val="left" w:pos="2124"/>
+          <w:tab w:val="left" w:pos="2832"/>
+          <w:tab w:val="left" w:pos="3540"/>
+          <w:tab w:val="left" w:pos="4248"/>
+          <w:tab w:val="left" w:pos="4956"/>
+          <w:tab w:val="left" w:pos="5664"/>
+          <w:tab w:val="left" w:pos="6372"/>
+          <w:tab w:val="left" w:pos="7080"/>
+          <w:tab w:val="left" w:pos="7788"/>
+          <w:tab w:val="left" w:pos="8496"/>
+          <w:tab w:val="left" w:pos="9204"/>
+          <w:tab w:val="left" w:pos="708"/>
+          <w:tab w:val="left" w:pos="1416"/>
+          <w:tab w:val="left" w:pos="2124"/>
+          <w:tab w:val="left" w:pos="2832"/>
+          <w:tab w:val="left" w:pos="3540"/>
+          <w:tab w:val="left" w:pos="4248"/>
+          <w:tab w:val="left" w:pos="4956"/>
+          <w:tab w:val="left" w:pos="5664"/>
+          <w:tab w:val="left" w:pos="6372"/>
+          <w:tab w:val="left" w:pos="7080"/>
+          <w:tab w:val="left" w:pos="7788"/>
+          <w:tab w:val="left" w:pos="8496"/>
+          <w:tab w:val="left" w:pos="9204"/>
+        </w:tabs>
+        <w:spacing w:after="200" w:line="276" w:lineRule="auto"/>
+        <w:ind w:left="0" w:firstLine="0"/>
         <w:rPr/>
       </w:pPr>
       <w:r>
         <w:rPr>
           <w:rtl w:val="0"/>
         </w:rPr>
-        <w:t xml:space="preserve">Se houver mais de um conjunto de dados, descrição de como serão agregados/mesclados.</w:t>
-      </w:r>
-    </w:p>
-    <w:p>
-      <w:pPr>
-        <w:tabs>
-          <w:tab w:val="left" w:pos="708"/>
-          <w:tab w:val="left" w:pos="1416"/>
-          <w:tab w:val="left" w:pos="2124"/>
-          <w:tab w:val="left" w:pos="2832"/>
-          <w:tab w:val="left" w:pos="3540"/>
-          <w:tab w:val="left" w:pos="4248"/>
-          <w:tab w:val="left" w:pos="4956"/>
-          <w:tab w:val="left" w:pos="5664"/>
-          <w:tab w:val="left" w:pos="6372"/>
-          <w:tab w:val="left" w:pos="7080"/>
-          <w:tab w:val="left" w:pos="7788"/>
-          <w:tab w:val="left" w:pos="8496"/>
-          <w:tab w:val="left" w:pos="9204"/>
-          <w:tab w:val="left" w:pos="708"/>
-          <w:tab w:val="left" w:pos="1416"/>
-          <w:tab w:val="left" w:pos="2124"/>
-          <w:tab w:val="left" w:pos="2832"/>
-          <w:tab w:val="left" w:pos="3540"/>
-          <w:tab w:val="left" w:pos="4248"/>
-          <w:tab w:val="left" w:pos="4956"/>
-          <w:tab w:val="left" w:pos="5664"/>
-          <w:tab w:val="left" w:pos="6372"/>
-          <w:tab w:val="left" w:pos="7080"/>
-          <w:tab w:val="left" w:pos="7788"/>
-          <w:tab w:val="left" w:pos="8496"/>
-          <w:tab w:val="left" w:pos="9204"/>
-        </w:tabs>
-        <w:spacing w:after="200" w:line="276" w:lineRule="auto"/>
-        <w:ind w:left="1440" w:firstLine="0"/>
-        <w:rPr/>
-      </w:pPr>
-      <w:r>
-        <w:rPr>
-          <w:rtl w:val="0"/>
-        </w:rPr>
-      </w:r>
-    </w:p>
-    <w:p>
-      <w:pPr>
-        <w:tabs>
-          <w:tab w:val="left" w:pos="708"/>
-          <w:tab w:val="left" w:pos="1416"/>
-          <w:tab w:val="left" w:pos="2124"/>
-          <w:tab w:val="left" w:pos="2832"/>
-          <w:tab w:val="left" w:pos="3540"/>
-          <w:tab w:val="left" w:pos="4248"/>
-          <w:tab w:val="left" w:pos="4956"/>
-          <w:tab w:val="left" w:pos="5664"/>
-          <w:tab w:val="left" w:pos="6372"/>
-          <w:tab w:val="left" w:pos="7080"/>
-          <w:tab w:val="left" w:pos="7788"/>
-          <w:tab w:val="left" w:pos="8496"/>
-          <w:tab w:val="left" w:pos="9204"/>
-          <w:tab w:val="left" w:pos="708"/>
-          <w:tab w:val="left" w:pos="1416"/>
-          <w:tab w:val="left" w:pos="2124"/>
-          <w:tab w:val="left" w:pos="2832"/>
-          <w:tab w:val="left" w:pos="3540"/>
-          <w:tab w:val="left" w:pos="4248"/>
-          <w:tab w:val="left" w:pos="4956"/>
-          <w:tab w:val="left" w:pos="5664"/>
-          <w:tab w:val="left" w:pos="6372"/>
-          <w:tab w:val="left" w:pos="7080"/>
-          <w:tab w:val="left" w:pos="7788"/>
-          <w:tab w:val="left" w:pos="8496"/>
-          <w:tab w:val="left" w:pos="9204"/>
-        </w:tabs>
-        <w:spacing w:after="200" w:line="276" w:lineRule="auto"/>
-        <w:ind w:left="1440" w:firstLine="0"/>
-        <w:rPr/>
-      </w:pPr>
-      <w:r>
-        <w:rPr>
-          <w:rtl w:val="0"/>
-        </w:rPr>
-      </w:r>
-    </w:p>
-    <w:p>
-      <w:pPr>
-        <w:numPr>
-          <w:ilvl w:val="1"/>
-          <w:numId w:val="5"/>
-        </w:numPr>
-        <w:tabs>
-          <w:tab w:val="left" w:pos="708"/>
-          <w:tab w:val="left" w:pos="1416"/>
-          <w:tab w:val="left" w:pos="2124"/>
-          <w:tab w:val="left" w:pos="2832"/>
-          <w:tab w:val="left" w:pos="3540"/>
-          <w:tab w:val="left" w:pos="4248"/>
-          <w:tab w:val="left" w:pos="4956"/>
-          <w:tab w:val="left" w:pos="5664"/>
-          <w:tab w:val="left" w:pos="6372"/>
-          <w:tab w:val="left" w:pos="7080"/>
-          <w:tab w:val="left" w:pos="7788"/>
-          <w:tab w:val="left" w:pos="8496"/>
-          <w:tab w:val="left" w:pos="9204"/>
-          <w:tab w:val="left" w:pos="708"/>
-          <w:tab w:val="left" w:pos="1416"/>
-          <w:tab w:val="left" w:pos="2124"/>
-          <w:tab w:val="left" w:pos="2832"/>
-          <w:tab w:val="left" w:pos="3540"/>
-          <w:tab w:val="left" w:pos="4248"/>
-          <w:tab w:val="left" w:pos="4956"/>
-          <w:tab w:val="left" w:pos="5664"/>
-          <w:tab w:val="left" w:pos="6372"/>
-          <w:tab w:val="left" w:pos="7080"/>
-          <w:tab w:val="left" w:pos="7788"/>
-          <w:tab w:val="left" w:pos="8496"/>
-          <w:tab w:val="left" w:pos="9204"/>
-        </w:tabs>
-        <w:spacing w:after="200" w:line="276" w:lineRule="auto"/>
-        <w:ind w:left="1440" w:hanging="360"/>
-        <w:rPr/>
-      </w:pPr>
-      <w:r>
-        <w:rPr>
-          <w:rtl w:val="0"/>
-        </w:rPr>
-        <w:t xml:space="preserve">Descrição dos riscos e contingências relacionados a esses dados (qualidade, cobertura/diversidade e acesso).</w:t>
-      </w:r>
-    </w:p>
-    <w:p>
-      <w:pPr>
-        <w:numPr>
-          <w:ilvl w:val="1"/>
-          <w:numId w:val="5"/>
-        </w:numPr>
-        <w:tabs>
-          <w:tab w:val="left" w:pos="708"/>
-          <w:tab w:val="left" w:pos="1416"/>
-          <w:tab w:val="left" w:pos="2124"/>
-          <w:tab w:val="left" w:pos="2832"/>
-          <w:tab w:val="left" w:pos="3540"/>
-          <w:tab w:val="left" w:pos="4248"/>
-          <w:tab w:val="left" w:pos="4956"/>
-          <w:tab w:val="left" w:pos="5664"/>
-          <w:tab w:val="left" w:pos="6372"/>
-          <w:tab w:val="left" w:pos="7080"/>
-          <w:tab w:val="left" w:pos="7788"/>
-          <w:tab w:val="left" w:pos="8496"/>
-          <w:tab w:val="left" w:pos="9204"/>
-          <w:tab w:val="left" w:pos="708"/>
-          <w:tab w:val="left" w:pos="1416"/>
-          <w:tab w:val="left" w:pos="2124"/>
-          <w:tab w:val="left" w:pos="2832"/>
-          <w:tab w:val="left" w:pos="3540"/>
-          <w:tab w:val="left" w:pos="4248"/>
-          <w:tab w:val="left" w:pos="4956"/>
-          <w:tab w:val="left" w:pos="5664"/>
-          <w:tab w:val="left" w:pos="6372"/>
-          <w:tab w:val="left" w:pos="7080"/>
-          <w:tab w:val="left" w:pos="7788"/>
-          <w:tab w:val="left" w:pos="8496"/>
-          <w:tab w:val="left" w:pos="9204"/>
-        </w:tabs>
-        <w:spacing w:after="200" w:line="276" w:lineRule="auto"/>
-        <w:ind w:left="1440" w:hanging="360"/>
-        <w:rPr/>
-      </w:pPr>
-      <w:r>
-        <w:rPr>
-          <w:rtl w:val="0"/>
-        </w:rPr>
-        <w:t xml:space="preserve">Se aplicável: descrição de como será selecionado o subconjunto para análises iniciais (quando o tamanho do conjunto de dados impossibilita a utilização do conjunto completo em todas as etapas da definição do modelo a ser usado).</w:t>
-      </w:r>
-    </w:p>
-    <w:p>
-      <w:pPr>
-        <w:numPr>
-          <w:ilvl w:val="1"/>
-          <w:numId w:val="5"/>
-        </w:numPr>
-        <w:tabs>
-          <w:tab w:val="left" w:pos="708"/>
-          <w:tab w:val="left" w:pos="1416"/>
-          <w:tab w:val="left" w:pos="2124"/>
-          <w:tab w:val="left" w:pos="2832"/>
-          <w:tab w:val="left" w:pos="3540"/>
-          <w:tab w:val="left" w:pos="4248"/>
-          <w:tab w:val="left" w:pos="4956"/>
-          <w:tab w:val="left" w:pos="5664"/>
-          <w:tab w:val="left" w:pos="6372"/>
-          <w:tab w:val="left" w:pos="7080"/>
-          <w:tab w:val="left" w:pos="7788"/>
-          <w:tab w:val="left" w:pos="8496"/>
-          <w:tab w:val="left" w:pos="9204"/>
-          <w:tab w:val="left" w:pos="708"/>
-          <w:tab w:val="left" w:pos="1416"/>
-          <w:tab w:val="left" w:pos="2124"/>
-          <w:tab w:val="left" w:pos="2832"/>
-          <w:tab w:val="left" w:pos="3540"/>
-          <w:tab w:val="left" w:pos="4248"/>
-          <w:tab w:val="left" w:pos="4956"/>
-          <w:tab w:val="left" w:pos="5664"/>
-          <w:tab w:val="left" w:pos="6372"/>
-          <w:tab w:val="left" w:pos="7080"/>
-          <w:tab w:val="left" w:pos="7788"/>
-          <w:tab w:val="left" w:pos="8496"/>
-          <w:tab w:val="left" w:pos="9204"/>
-        </w:tabs>
-        <w:spacing w:after="200" w:line="276" w:lineRule="auto"/>
-        <w:ind w:left="1440" w:hanging="360"/>
-        <w:rPr/>
-      </w:pPr>
-      <w:r>
-        <w:rPr>
-          <w:rtl w:val="0"/>
-        </w:rPr>
-        <w:t xml:space="preserve">Se houver: descrição das restrições de segurança.</w:t>
+        <w:tab/>
+        <w:t xml:space="preserve">Uma alternativa que encontramos para a mesclagem de todos esses dados que nos foram disponíveis foi a união de informações que possuem o mesmo identificador. Por exemplo, conseguimos mapear todas as informações disponíveis em relação a um entregador específico quando puxamos seu ID de todas as tabelas. Dessa forma, montaremos nossas pesquisas e análises para que possamos ter uma boa base para formação de nossas hipóteses.</w:t>
       </w:r>
     </w:p>
     <w:p>
@@ -10121,21 +9974,294 @@
           <w:tab w:val="left" w:pos="9204"/>
         </w:tabs>
         <w:spacing w:after="200" w:line="276" w:lineRule="auto"/>
-        <w:ind w:left="720" w:hanging="360"/>
+        <w:ind w:left="1440" w:hanging="360"/>
+        <w:rPr>
+          <w:i w:val="1"/>
+          <w:color w:val="3c0a49"/>
+        </w:rPr>
+      </w:pPr>
+      <w:r>
+        <w:rPr>
+          <w:i w:val="1"/>
+          <w:color w:val="3c0a49"/>
+          <w:rtl w:val="0"/>
+        </w:rPr>
+        <w:t xml:space="preserve">Descrição dos riscos e contingências relacionados a esses dados (qualidade, cobertura/diversidade e acesso).</w:t>
+      </w:r>
+    </w:p>
+    <w:p>
+      <w:pPr>
+        <w:tabs>
+          <w:tab w:val="left" w:pos="708"/>
+          <w:tab w:val="left" w:pos="1416"/>
+          <w:tab w:val="left" w:pos="2124"/>
+          <w:tab w:val="left" w:pos="2832"/>
+          <w:tab w:val="left" w:pos="3540"/>
+          <w:tab w:val="left" w:pos="4248"/>
+          <w:tab w:val="left" w:pos="4956"/>
+          <w:tab w:val="left" w:pos="5664"/>
+          <w:tab w:val="left" w:pos="6372"/>
+          <w:tab w:val="left" w:pos="7080"/>
+          <w:tab w:val="left" w:pos="7788"/>
+          <w:tab w:val="left" w:pos="8496"/>
+          <w:tab w:val="left" w:pos="9204"/>
+          <w:tab w:val="left" w:pos="708"/>
+          <w:tab w:val="left" w:pos="1416"/>
+          <w:tab w:val="left" w:pos="2124"/>
+          <w:tab w:val="left" w:pos="2832"/>
+          <w:tab w:val="left" w:pos="3540"/>
+          <w:tab w:val="left" w:pos="4248"/>
+          <w:tab w:val="left" w:pos="4956"/>
+          <w:tab w:val="left" w:pos="5664"/>
+          <w:tab w:val="left" w:pos="6372"/>
+          <w:tab w:val="left" w:pos="7080"/>
+          <w:tab w:val="left" w:pos="7788"/>
+          <w:tab w:val="left" w:pos="8496"/>
+          <w:tab w:val="left" w:pos="9204"/>
+        </w:tabs>
+        <w:spacing w:after="200" w:line="276" w:lineRule="auto"/>
+        <w:ind w:left="0" w:firstLine="0"/>
         <w:rPr/>
       </w:pPr>
       <w:r>
         <w:rPr>
           <w:rtl w:val="0"/>
         </w:rPr>
-        <w:t xml:space="preserve">Descrição estatística básica dos dados, principalmente dos atributos de interesse, com inclusão de visualizações gráficas e como essas análises embasam suas hipóteses.</w:t>
+        <w:tab/>
+        <w:t xml:space="preserve">Quando analisada a qualidade das bases de dados disponibilizadas pelo nosso cliente nos deparamos com muitas inconsistências e informações bagunçadas e sem contexto. Como também muitos dados que fogem totalmente do padrão o que causa uma certa dificuldade na análise e estudo dos mesmos.</w:t>
+      </w:r>
+    </w:p>
+    <w:p>
+      <w:pPr>
+        <w:tabs>
+          <w:tab w:val="left" w:pos="708"/>
+          <w:tab w:val="left" w:pos="1416"/>
+          <w:tab w:val="left" w:pos="2124"/>
+          <w:tab w:val="left" w:pos="2832"/>
+          <w:tab w:val="left" w:pos="3540"/>
+          <w:tab w:val="left" w:pos="4248"/>
+          <w:tab w:val="left" w:pos="4956"/>
+          <w:tab w:val="left" w:pos="5664"/>
+          <w:tab w:val="left" w:pos="6372"/>
+          <w:tab w:val="left" w:pos="7080"/>
+          <w:tab w:val="left" w:pos="7788"/>
+          <w:tab w:val="left" w:pos="8496"/>
+          <w:tab w:val="left" w:pos="9204"/>
+          <w:tab w:val="left" w:pos="708"/>
+          <w:tab w:val="left" w:pos="1416"/>
+          <w:tab w:val="left" w:pos="2124"/>
+          <w:tab w:val="left" w:pos="2832"/>
+          <w:tab w:val="left" w:pos="3540"/>
+          <w:tab w:val="left" w:pos="4248"/>
+          <w:tab w:val="left" w:pos="4956"/>
+          <w:tab w:val="left" w:pos="5664"/>
+          <w:tab w:val="left" w:pos="6372"/>
+          <w:tab w:val="left" w:pos="7080"/>
+          <w:tab w:val="left" w:pos="7788"/>
+          <w:tab w:val="left" w:pos="8496"/>
+          <w:tab w:val="left" w:pos="9204"/>
+        </w:tabs>
+        <w:spacing w:after="200" w:line="276" w:lineRule="auto"/>
+        <w:ind w:left="0" w:firstLine="0"/>
+        <w:rPr/>
+      </w:pPr>
+      <w:r>
+        <w:rPr>
+          <w:rtl w:val="0"/>
+        </w:rPr>
+        <w:tab/>
+        <w:t xml:space="preserve">No quesito cobertura/diversidade dos dados, pudemos notar a grande quantidade de informações presentes em diversas tabelas. Essa gama de informações serão analisadas e interpretadas com muita cautela para que não haja conflito no momento da mesclagem.</w:t>
+      </w:r>
+    </w:p>
+    <w:p>
+      <w:pPr>
+        <w:tabs>
+          <w:tab w:val="left" w:pos="708"/>
+          <w:tab w:val="left" w:pos="1416"/>
+          <w:tab w:val="left" w:pos="2124"/>
+          <w:tab w:val="left" w:pos="2832"/>
+          <w:tab w:val="left" w:pos="3540"/>
+          <w:tab w:val="left" w:pos="4248"/>
+          <w:tab w:val="left" w:pos="4956"/>
+          <w:tab w:val="left" w:pos="5664"/>
+          <w:tab w:val="left" w:pos="6372"/>
+          <w:tab w:val="left" w:pos="7080"/>
+          <w:tab w:val="left" w:pos="7788"/>
+          <w:tab w:val="left" w:pos="8496"/>
+          <w:tab w:val="left" w:pos="9204"/>
+          <w:tab w:val="left" w:pos="708"/>
+          <w:tab w:val="left" w:pos="1416"/>
+          <w:tab w:val="left" w:pos="2124"/>
+          <w:tab w:val="left" w:pos="2832"/>
+          <w:tab w:val="left" w:pos="3540"/>
+          <w:tab w:val="left" w:pos="4248"/>
+          <w:tab w:val="left" w:pos="4956"/>
+          <w:tab w:val="left" w:pos="5664"/>
+          <w:tab w:val="left" w:pos="6372"/>
+          <w:tab w:val="left" w:pos="7080"/>
+          <w:tab w:val="left" w:pos="7788"/>
+          <w:tab w:val="left" w:pos="8496"/>
+          <w:tab w:val="left" w:pos="9204"/>
+        </w:tabs>
+        <w:spacing w:after="200" w:line="276" w:lineRule="auto"/>
+        <w:ind w:left="0" w:firstLine="0"/>
+        <w:rPr/>
+      </w:pPr>
+      <w:r>
+        <w:rPr>
+          <w:rtl w:val="0"/>
+        </w:rPr>
+        <w:tab/>
+        <w:t xml:space="preserve">Especificamente na questão de acesso, a Rappi se disponibilizou em proporcionar o máximo de informações autorizadas possíveis, porém, há certas regras internas na empresa que inviabilizam a liberação de certos dados que talvez poderiam ser de boa utilização na modelagem de nossas hipóteses.</w:t>
+      </w:r>
+    </w:p>
+    <w:p>
+      <w:pPr>
+        <w:numPr>
+          <w:ilvl w:val="1"/>
+          <w:numId w:val="6"/>
+        </w:numPr>
+        <w:tabs>
+          <w:tab w:val="left" w:pos="708"/>
+          <w:tab w:val="left" w:pos="1416"/>
+          <w:tab w:val="left" w:pos="2124"/>
+          <w:tab w:val="left" w:pos="2832"/>
+          <w:tab w:val="left" w:pos="3540"/>
+          <w:tab w:val="left" w:pos="4248"/>
+          <w:tab w:val="left" w:pos="4956"/>
+          <w:tab w:val="left" w:pos="5664"/>
+          <w:tab w:val="left" w:pos="6372"/>
+          <w:tab w:val="left" w:pos="7080"/>
+          <w:tab w:val="left" w:pos="7788"/>
+          <w:tab w:val="left" w:pos="8496"/>
+          <w:tab w:val="left" w:pos="9204"/>
+          <w:tab w:val="left" w:pos="708"/>
+          <w:tab w:val="left" w:pos="1416"/>
+          <w:tab w:val="left" w:pos="2124"/>
+          <w:tab w:val="left" w:pos="2832"/>
+          <w:tab w:val="left" w:pos="3540"/>
+          <w:tab w:val="left" w:pos="4248"/>
+          <w:tab w:val="left" w:pos="4956"/>
+          <w:tab w:val="left" w:pos="5664"/>
+          <w:tab w:val="left" w:pos="6372"/>
+          <w:tab w:val="left" w:pos="7080"/>
+          <w:tab w:val="left" w:pos="7788"/>
+          <w:tab w:val="left" w:pos="8496"/>
+          <w:tab w:val="left" w:pos="9204"/>
+        </w:tabs>
+        <w:spacing w:after="200" w:line="276" w:lineRule="auto"/>
+        <w:ind w:left="1440" w:hanging="360"/>
+        <w:rPr>
+          <w:i w:val="1"/>
+          <w:color w:val="3c0a49"/>
+        </w:rPr>
+      </w:pPr>
+      <w:r>
+        <w:rPr>
+          <w:i w:val="1"/>
+          <w:color w:val="3c0a49"/>
+          <w:rtl w:val="0"/>
+        </w:rPr>
+        <w:t xml:space="preserve">Se aplicável: descrição de como será selecionado o subconjunto para análises iniciais (quando o tamanho do conjunto de dados impossibilita a utilização do conjunto completo em todas as etapas da definição do modelo a ser usado).</w:t>
+      </w:r>
+    </w:p>
+    <w:p>
+      <w:pPr>
+        <w:numPr>
+          <w:ilvl w:val="1"/>
+          <w:numId w:val="6"/>
+        </w:numPr>
+        <w:tabs>
+          <w:tab w:val="left" w:pos="708"/>
+          <w:tab w:val="left" w:pos="1416"/>
+          <w:tab w:val="left" w:pos="2124"/>
+          <w:tab w:val="left" w:pos="2832"/>
+          <w:tab w:val="left" w:pos="3540"/>
+          <w:tab w:val="left" w:pos="4248"/>
+          <w:tab w:val="left" w:pos="4956"/>
+          <w:tab w:val="left" w:pos="5664"/>
+          <w:tab w:val="left" w:pos="6372"/>
+          <w:tab w:val="left" w:pos="7080"/>
+          <w:tab w:val="left" w:pos="7788"/>
+          <w:tab w:val="left" w:pos="8496"/>
+          <w:tab w:val="left" w:pos="9204"/>
+          <w:tab w:val="left" w:pos="708"/>
+          <w:tab w:val="left" w:pos="1416"/>
+          <w:tab w:val="left" w:pos="2124"/>
+          <w:tab w:val="left" w:pos="2832"/>
+          <w:tab w:val="left" w:pos="3540"/>
+          <w:tab w:val="left" w:pos="4248"/>
+          <w:tab w:val="left" w:pos="4956"/>
+          <w:tab w:val="left" w:pos="5664"/>
+          <w:tab w:val="left" w:pos="6372"/>
+          <w:tab w:val="left" w:pos="7080"/>
+          <w:tab w:val="left" w:pos="7788"/>
+          <w:tab w:val="left" w:pos="8496"/>
+          <w:tab w:val="left" w:pos="9204"/>
+        </w:tabs>
+        <w:spacing w:after="200" w:line="276" w:lineRule="auto"/>
+        <w:ind w:left="1440" w:hanging="360"/>
+        <w:rPr>
+          <w:i w:val="1"/>
+          <w:color w:val="3c0a49"/>
+        </w:rPr>
+      </w:pPr>
+      <w:r>
+        <w:rPr>
+          <w:i w:val="1"/>
+          <w:color w:val="3c0a49"/>
+          <w:rtl w:val="0"/>
+        </w:rPr>
+        <w:t xml:space="preserve">Se houver: descrição das restrições de segurança.</w:t>
+      </w:r>
+    </w:p>
+    <w:p>
+      <w:pPr>
+        <w:tabs>
+          <w:tab w:val="left" w:pos="708"/>
+          <w:tab w:val="left" w:pos="1416"/>
+          <w:tab w:val="left" w:pos="2124"/>
+          <w:tab w:val="left" w:pos="2832"/>
+          <w:tab w:val="left" w:pos="3540"/>
+          <w:tab w:val="left" w:pos="4248"/>
+          <w:tab w:val="left" w:pos="4956"/>
+          <w:tab w:val="left" w:pos="5664"/>
+          <w:tab w:val="left" w:pos="6372"/>
+          <w:tab w:val="left" w:pos="7080"/>
+          <w:tab w:val="left" w:pos="7788"/>
+          <w:tab w:val="left" w:pos="8496"/>
+          <w:tab w:val="left" w:pos="9204"/>
+          <w:tab w:val="left" w:pos="708"/>
+          <w:tab w:val="left" w:pos="1416"/>
+          <w:tab w:val="left" w:pos="2124"/>
+          <w:tab w:val="left" w:pos="2832"/>
+          <w:tab w:val="left" w:pos="3540"/>
+          <w:tab w:val="left" w:pos="4248"/>
+          <w:tab w:val="left" w:pos="4956"/>
+          <w:tab w:val="left" w:pos="5664"/>
+          <w:tab w:val="left" w:pos="6372"/>
+          <w:tab w:val="left" w:pos="7080"/>
+          <w:tab w:val="left" w:pos="7788"/>
+          <w:tab w:val="left" w:pos="8496"/>
+          <w:tab w:val="left" w:pos="9204"/>
+        </w:tabs>
+        <w:spacing w:after="200" w:line="276" w:lineRule="auto"/>
+        <w:ind w:left="0" w:firstLine="0"/>
+        <w:rPr/>
+      </w:pPr>
+      <w:r>
+        <w:rPr>
+          <w:rtl w:val="0"/>
+        </w:rPr>
+        <w:tab/>
+        <w:t xml:space="preserve">Quanto às restrições de segurança tomadas em relação ao projeto, tivemos o cuidado e a delicadeza de não publicar ou compartilhar os dados sensíveis e pessoais referentes à Rappi, priorizamos por uma conduta ética que esteja dentro da LGPD.</w:t>
       </w:r>
     </w:p>
     <w:p>
       <w:pPr>
         <w:numPr>
           <w:ilvl w:val="0"/>
-          <w:numId w:val="5"/>
+          <w:numId w:val="6"/>
         </w:numPr>
         <w:tabs>
           <w:tab w:val="left" w:pos="708"/>
@@ -10167,13 +10293,383 @@
         </w:tabs>
         <w:spacing w:after="200" w:line="276" w:lineRule="auto"/>
         <w:ind w:left="720" w:hanging="360"/>
+        <w:rPr>
+          <w:b w:val="1"/>
+          <w:color w:val="3c0a49"/>
+        </w:rPr>
+      </w:pPr>
+      <w:r>
+        <w:rPr>
+          <w:b w:val="1"/>
+          <w:color w:val="3c0a49"/>
+          <w:rtl w:val="0"/>
+        </w:rPr>
+        <w:t xml:space="preserve">Descrição estatística básica dos dados, principalmente dos atributos de interesse, com inclusão de visualizações gráficas e como essas análises embasam suas hipóteses.</w:t>
+      </w:r>
+    </w:p>
+    <w:p>
+      <w:pPr>
+        <w:tabs>
+          <w:tab w:val="left" w:pos="708"/>
+          <w:tab w:val="left" w:pos="1416"/>
+          <w:tab w:val="left" w:pos="2124"/>
+          <w:tab w:val="left" w:pos="2832"/>
+          <w:tab w:val="left" w:pos="3540"/>
+          <w:tab w:val="left" w:pos="4248"/>
+          <w:tab w:val="left" w:pos="4956"/>
+          <w:tab w:val="left" w:pos="5664"/>
+          <w:tab w:val="left" w:pos="6372"/>
+          <w:tab w:val="left" w:pos="7080"/>
+          <w:tab w:val="left" w:pos="7788"/>
+          <w:tab w:val="left" w:pos="8496"/>
+          <w:tab w:val="left" w:pos="9204"/>
+          <w:tab w:val="left" w:pos="708"/>
+          <w:tab w:val="left" w:pos="1416"/>
+          <w:tab w:val="left" w:pos="2124"/>
+          <w:tab w:val="left" w:pos="2832"/>
+          <w:tab w:val="left" w:pos="3540"/>
+          <w:tab w:val="left" w:pos="4248"/>
+          <w:tab w:val="left" w:pos="4956"/>
+          <w:tab w:val="left" w:pos="5664"/>
+          <w:tab w:val="left" w:pos="6372"/>
+          <w:tab w:val="left" w:pos="7080"/>
+          <w:tab w:val="left" w:pos="7788"/>
+          <w:tab w:val="left" w:pos="8496"/>
+          <w:tab w:val="left" w:pos="9204"/>
+        </w:tabs>
+        <w:spacing w:after="200" w:line="276" w:lineRule="auto"/>
+        <w:ind w:left="0" w:firstLine="0"/>
+        <w:rPr>
+          <w:color w:val="4472c4"/>
+          <w:u w:val="single"/>
+        </w:rPr>
+      </w:pPr>
+      <w:r>
+        <w:rPr>
+          <w:b w:val="1"/>
+          <w:color w:val="3c0a49"/>
+          <w:rtl w:val="0"/>
+        </w:rPr>
+        <w:tab/>
+      </w:r>
+      <w:r>
+        <w:rPr>
+          <w:rtl w:val="0"/>
+        </w:rPr>
+        <w:t xml:space="preserve">Toda a nossa descrição estatística dos dados foi feita na plataforma Google Colab, onde nós importamos todas as bases e começamos a analisar e identificar quais seriam os atributos que mais serviram para modelagem de nosso sistema. Segue o link para acesso: </w:t>
+      </w:r>
+      <w:hyperlink r:id="rId19">
+        <w:r>
+          <w:rPr>
+            <w:color w:val="1155cc"/>
+            <w:u w:val="single"/>
+            <w:rtl w:val="0"/>
+          </w:rPr>
+          <w:t xml:space="preserve">https://colab.research.google.com/drive/1D9QhWS88QVTpAnpA5vzVGT9gZ2rJgJDi</w:t>
+        </w:r>
+      </w:hyperlink>
+      <w:r>
+        <w:rPr>
+          <w:rtl w:val="0"/>
+        </w:rPr>
+      </w:r>
+    </w:p>
+    <w:p>
+      <w:pPr>
+        <w:tabs>
+          <w:tab w:val="left" w:pos="708"/>
+          <w:tab w:val="left" w:pos="1416"/>
+          <w:tab w:val="left" w:pos="2124"/>
+          <w:tab w:val="left" w:pos="2832"/>
+          <w:tab w:val="left" w:pos="3540"/>
+          <w:tab w:val="left" w:pos="4248"/>
+          <w:tab w:val="left" w:pos="4956"/>
+          <w:tab w:val="left" w:pos="5664"/>
+          <w:tab w:val="left" w:pos="6372"/>
+          <w:tab w:val="left" w:pos="7080"/>
+          <w:tab w:val="left" w:pos="7788"/>
+          <w:tab w:val="left" w:pos="8496"/>
+          <w:tab w:val="left" w:pos="9204"/>
+          <w:tab w:val="left" w:pos="708"/>
+          <w:tab w:val="left" w:pos="1416"/>
+          <w:tab w:val="left" w:pos="2124"/>
+          <w:tab w:val="left" w:pos="2832"/>
+          <w:tab w:val="left" w:pos="3540"/>
+          <w:tab w:val="left" w:pos="4248"/>
+          <w:tab w:val="left" w:pos="4956"/>
+          <w:tab w:val="left" w:pos="5664"/>
+          <w:tab w:val="left" w:pos="6372"/>
+          <w:tab w:val="left" w:pos="7080"/>
+          <w:tab w:val="left" w:pos="7788"/>
+          <w:tab w:val="left" w:pos="8496"/>
+          <w:tab w:val="left" w:pos="9204"/>
+        </w:tabs>
+        <w:spacing w:after="200" w:line="276" w:lineRule="auto"/>
+        <w:ind w:left="0" w:firstLine="0"/>
         <w:rPr/>
       </w:pPr>
       <w:r>
         <w:rPr>
           <w:rtl w:val="0"/>
         </w:rPr>
+        <w:t xml:space="preserve">Nesta análise inicial feita por nosso grupo, esmiuçamos cada tabela para trazer todos os dados quantitativos que possam ser úteis para nosso sistema. Também trouxemos representações gráficas que embasam nossas primeiras hipóteses, são elas:</w:t>
+      </w:r>
+    </w:p>
+    <w:p>
+      <w:pPr>
+        <w:tabs>
+          <w:tab w:val="left" w:pos="708"/>
+          <w:tab w:val="left" w:pos="1416"/>
+          <w:tab w:val="left" w:pos="2124"/>
+          <w:tab w:val="left" w:pos="2832"/>
+          <w:tab w:val="left" w:pos="3540"/>
+          <w:tab w:val="left" w:pos="4248"/>
+          <w:tab w:val="left" w:pos="4956"/>
+          <w:tab w:val="left" w:pos="5664"/>
+          <w:tab w:val="left" w:pos="6372"/>
+          <w:tab w:val="left" w:pos="7080"/>
+          <w:tab w:val="left" w:pos="7788"/>
+          <w:tab w:val="left" w:pos="8496"/>
+          <w:tab w:val="left" w:pos="9204"/>
+          <w:tab w:val="left" w:pos="708"/>
+          <w:tab w:val="left" w:pos="1416"/>
+          <w:tab w:val="left" w:pos="2124"/>
+          <w:tab w:val="left" w:pos="2832"/>
+          <w:tab w:val="left" w:pos="3540"/>
+          <w:tab w:val="left" w:pos="4248"/>
+          <w:tab w:val="left" w:pos="4956"/>
+          <w:tab w:val="left" w:pos="5664"/>
+          <w:tab w:val="left" w:pos="6372"/>
+          <w:tab w:val="left" w:pos="7080"/>
+          <w:tab w:val="left" w:pos="7788"/>
+          <w:tab w:val="left" w:pos="8496"/>
+          <w:tab w:val="left" w:pos="9204"/>
+        </w:tabs>
+        <w:spacing w:after="200" w:line="276" w:lineRule="auto"/>
+        <w:ind w:left="0" w:firstLine="0"/>
+        <w:rPr/>
+      </w:pPr>
+      <w:r>
+        <w:rPr>
+          <w:rtl w:val="0"/>
+        </w:rPr>
+        <w:t xml:space="preserve">1- A visualização da distribuição de rendimentos dos couriers e ex-outliers para nos contextualizarmos sobre a situação de ganhos médios mensais dos entregadores que nos traz uma contextualização da renda dos entregadores. (disponível na seção "Data Frame Earnings” do Notebook.) </w:t>
+      </w:r>
+    </w:p>
+    <w:p>
+      <w:pPr>
+        <w:tabs>
+          <w:tab w:val="left" w:pos="708"/>
+          <w:tab w:val="left" w:pos="1416"/>
+          <w:tab w:val="left" w:pos="2124"/>
+          <w:tab w:val="left" w:pos="2832"/>
+          <w:tab w:val="left" w:pos="3540"/>
+          <w:tab w:val="left" w:pos="4248"/>
+          <w:tab w:val="left" w:pos="4956"/>
+          <w:tab w:val="left" w:pos="5664"/>
+          <w:tab w:val="left" w:pos="6372"/>
+          <w:tab w:val="left" w:pos="7080"/>
+          <w:tab w:val="left" w:pos="7788"/>
+          <w:tab w:val="left" w:pos="8496"/>
+          <w:tab w:val="left" w:pos="9204"/>
+          <w:tab w:val="left" w:pos="708"/>
+          <w:tab w:val="left" w:pos="1416"/>
+          <w:tab w:val="left" w:pos="2124"/>
+          <w:tab w:val="left" w:pos="2832"/>
+          <w:tab w:val="left" w:pos="3540"/>
+          <w:tab w:val="left" w:pos="4248"/>
+          <w:tab w:val="left" w:pos="4956"/>
+          <w:tab w:val="left" w:pos="5664"/>
+          <w:tab w:val="left" w:pos="6372"/>
+          <w:tab w:val="left" w:pos="7080"/>
+          <w:tab w:val="left" w:pos="7788"/>
+          <w:tab w:val="left" w:pos="8496"/>
+          <w:tab w:val="left" w:pos="9204"/>
+        </w:tabs>
+        <w:spacing w:after="200" w:line="276" w:lineRule="auto"/>
+        <w:ind w:left="0" w:firstLine="0"/>
+        <w:rPr/>
+      </w:pPr>
+      <w:r>
+        <w:rPr>
+          <w:rtl w:val="0"/>
+        </w:rPr>
+        <w:t xml:space="preserve">2- Visualização da distribuição de rendimentos no sweet spot que nos disponibiliza uma visualização mais real do que seriam os verdadeiros ganhos mensais de um entregador, ou seja, foram retirados os pontos fora da curva (outliers). Essa visualização pode ser encontrada também na seção “Data Frame Earnings”.</w:t>
+      </w:r>
+    </w:p>
+    <w:p>
+      <w:pPr>
+        <w:tabs>
+          <w:tab w:val="left" w:pos="708"/>
+          <w:tab w:val="left" w:pos="1416"/>
+          <w:tab w:val="left" w:pos="2124"/>
+          <w:tab w:val="left" w:pos="2832"/>
+          <w:tab w:val="left" w:pos="3540"/>
+          <w:tab w:val="left" w:pos="4248"/>
+          <w:tab w:val="left" w:pos="4956"/>
+          <w:tab w:val="left" w:pos="5664"/>
+          <w:tab w:val="left" w:pos="6372"/>
+          <w:tab w:val="left" w:pos="7080"/>
+          <w:tab w:val="left" w:pos="7788"/>
+          <w:tab w:val="left" w:pos="8496"/>
+          <w:tab w:val="left" w:pos="9204"/>
+          <w:tab w:val="left" w:pos="708"/>
+          <w:tab w:val="left" w:pos="1416"/>
+          <w:tab w:val="left" w:pos="2124"/>
+          <w:tab w:val="left" w:pos="2832"/>
+          <w:tab w:val="left" w:pos="3540"/>
+          <w:tab w:val="left" w:pos="4248"/>
+          <w:tab w:val="left" w:pos="4956"/>
+          <w:tab w:val="left" w:pos="5664"/>
+          <w:tab w:val="left" w:pos="6372"/>
+          <w:tab w:val="left" w:pos="7080"/>
+          <w:tab w:val="left" w:pos="7788"/>
+          <w:tab w:val="left" w:pos="8496"/>
+          <w:tab w:val="left" w:pos="9204"/>
+        </w:tabs>
+        <w:spacing w:after="200" w:line="276" w:lineRule="auto"/>
+        <w:ind w:left="0" w:firstLine="0"/>
+        <w:rPr/>
+      </w:pPr>
+      <w:r>
+        <w:rPr>
+          <w:rtl w:val="0"/>
+        </w:rPr>
+        <w:t xml:space="preserve">3- Uma visão da correlação alta entre o nível de renda e ganhos com gorjetas para que possamos entender se uma influencia a outra, e, se isso é um causador de “churn” do entregador. Também disponível na seção “Data Frame Earnings” do Notebook.</w:t>
+      </w:r>
+    </w:p>
+    <w:p>
+      <w:pPr>
+        <w:tabs>
+          <w:tab w:val="left" w:pos="708"/>
+          <w:tab w:val="left" w:pos="1416"/>
+          <w:tab w:val="left" w:pos="2124"/>
+          <w:tab w:val="left" w:pos="2832"/>
+          <w:tab w:val="left" w:pos="3540"/>
+          <w:tab w:val="left" w:pos="4248"/>
+          <w:tab w:val="left" w:pos="4956"/>
+          <w:tab w:val="left" w:pos="5664"/>
+          <w:tab w:val="left" w:pos="6372"/>
+          <w:tab w:val="left" w:pos="7080"/>
+          <w:tab w:val="left" w:pos="7788"/>
+          <w:tab w:val="left" w:pos="8496"/>
+          <w:tab w:val="left" w:pos="9204"/>
+          <w:tab w:val="left" w:pos="708"/>
+          <w:tab w:val="left" w:pos="1416"/>
+          <w:tab w:val="left" w:pos="2124"/>
+          <w:tab w:val="left" w:pos="2832"/>
+          <w:tab w:val="left" w:pos="3540"/>
+          <w:tab w:val="left" w:pos="4248"/>
+          <w:tab w:val="left" w:pos="4956"/>
+          <w:tab w:val="left" w:pos="5664"/>
+          <w:tab w:val="left" w:pos="6372"/>
+          <w:tab w:val="left" w:pos="7080"/>
+          <w:tab w:val="left" w:pos="7788"/>
+          <w:tab w:val="left" w:pos="8496"/>
+          <w:tab w:val="left" w:pos="9204"/>
+        </w:tabs>
+        <w:spacing w:after="200" w:line="276" w:lineRule="auto"/>
+        <w:ind w:left="0" w:firstLine="0"/>
+        <w:rPr>
+          <w:color w:val="4472c4"/>
+          <w:u w:val="single"/>
+        </w:rPr>
+      </w:pPr>
+      <w:r>
+        <w:rPr>
+          <w:rtl w:val="0"/>
+        </w:rPr>
+      </w:r>
+    </w:p>
+    <w:p>
+      <w:pPr>
+        <w:numPr>
+          <w:ilvl w:val="0"/>
+          <w:numId w:val="6"/>
+        </w:numPr>
+        <w:tabs>
+          <w:tab w:val="left" w:pos="708"/>
+          <w:tab w:val="left" w:pos="1416"/>
+          <w:tab w:val="left" w:pos="2124"/>
+          <w:tab w:val="left" w:pos="2832"/>
+          <w:tab w:val="left" w:pos="3540"/>
+          <w:tab w:val="left" w:pos="4248"/>
+          <w:tab w:val="left" w:pos="4956"/>
+          <w:tab w:val="left" w:pos="5664"/>
+          <w:tab w:val="left" w:pos="6372"/>
+          <w:tab w:val="left" w:pos="7080"/>
+          <w:tab w:val="left" w:pos="7788"/>
+          <w:tab w:val="left" w:pos="8496"/>
+          <w:tab w:val="left" w:pos="9204"/>
+          <w:tab w:val="left" w:pos="708"/>
+          <w:tab w:val="left" w:pos="1416"/>
+          <w:tab w:val="left" w:pos="2124"/>
+          <w:tab w:val="left" w:pos="2832"/>
+          <w:tab w:val="left" w:pos="3540"/>
+          <w:tab w:val="left" w:pos="4248"/>
+          <w:tab w:val="left" w:pos="4956"/>
+          <w:tab w:val="left" w:pos="5664"/>
+          <w:tab w:val="left" w:pos="6372"/>
+          <w:tab w:val="left" w:pos="7080"/>
+          <w:tab w:val="left" w:pos="7788"/>
+          <w:tab w:val="left" w:pos="8496"/>
+          <w:tab w:val="left" w:pos="9204"/>
+        </w:tabs>
+        <w:spacing w:after="200" w:line="276" w:lineRule="auto"/>
+        <w:ind w:left="720" w:hanging="360"/>
+        <w:rPr>
+          <w:b w:val="1"/>
+          <w:color w:val="3c0a49"/>
+        </w:rPr>
+      </w:pPr>
+      <w:r>
+        <w:rPr>
+          <w:b w:val="1"/>
+          <w:color w:val="3c0a49"/>
+          <w:rtl w:val="0"/>
+        </w:rPr>
         <w:t xml:space="preserve">Descrição da predição desejada (“target”), identificando sua natureza (binária, contínua, etc.)</w:t>
+      </w:r>
+    </w:p>
+    <w:p>
+      <w:pPr>
+        <w:tabs>
+          <w:tab w:val="left" w:pos="708"/>
+          <w:tab w:val="left" w:pos="1416"/>
+          <w:tab w:val="left" w:pos="2124"/>
+          <w:tab w:val="left" w:pos="2832"/>
+          <w:tab w:val="left" w:pos="3540"/>
+          <w:tab w:val="left" w:pos="4248"/>
+          <w:tab w:val="left" w:pos="4956"/>
+          <w:tab w:val="left" w:pos="5664"/>
+          <w:tab w:val="left" w:pos="6372"/>
+          <w:tab w:val="left" w:pos="7080"/>
+          <w:tab w:val="left" w:pos="7788"/>
+          <w:tab w:val="left" w:pos="8496"/>
+          <w:tab w:val="left" w:pos="9204"/>
+          <w:tab w:val="left" w:pos="708"/>
+          <w:tab w:val="left" w:pos="1416"/>
+          <w:tab w:val="left" w:pos="2124"/>
+          <w:tab w:val="left" w:pos="2832"/>
+          <w:tab w:val="left" w:pos="3540"/>
+          <w:tab w:val="left" w:pos="4248"/>
+          <w:tab w:val="left" w:pos="4956"/>
+          <w:tab w:val="left" w:pos="5664"/>
+          <w:tab w:val="left" w:pos="6372"/>
+          <w:tab w:val="left" w:pos="7080"/>
+          <w:tab w:val="left" w:pos="7788"/>
+          <w:tab w:val="left" w:pos="8496"/>
+          <w:tab w:val="left" w:pos="9204"/>
+        </w:tabs>
+        <w:spacing w:after="200" w:line="276" w:lineRule="auto"/>
+        <w:ind w:left="720" w:firstLine="0"/>
+        <w:rPr/>
+      </w:pPr>
+      <w:r>
+        <w:rPr>
+          <w:rtl w:val="0"/>
+        </w:rPr>
+        <w:t xml:space="preserve">O target do nosso projeto é uma classe, ou seja, queremos a probabilidade de um entregador dar churn na plataforma, logo, há apenas duas possibilidades de acontecimento: 1- saída do entregador da plataforma ou 2- permanência do RT.</w:t>
       </w:r>
     </w:p>
     <w:p>
@@ -12819,7 +13315,7 @@
           <w:szCs w:val="20"/>
         </w:rPr>
       </w:pPr>
-      <w:hyperlink r:id="rId19">
+      <w:hyperlink r:id="rId20">
         <w:r>
           <w:rPr>
             <w:color w:val="1155cc"/>
@@ -12876,7 +13372,7 @@
           <w:szCs w:val="20"/>
         </w:rPr>
       </w:pPr>
-      <w:hyperlink r:id="rId20">
+      <w:hyperlink r:id="rId21">
         <w:r>
           <w:rPr>
             <w:color w:val="1155cc"/>
@@ -12933,7 +13429,7 @@
           <w:szCs w:val="20"/>
         </w:rPr>
       </w:pPr>
-      <w:hyperlink r:id="rId21">
+      <w:hyperlink r:id="rId22">
         <w:r>
           <w:rPr>
             <w:color w:val="1155cc"/>
@@ -12993,7 +13489,7 @@
           <w:szCs w:val="20"/>
         </w:rPr>
       </w:pPr>
-      <w:hyperlink r:id="rId22">
+      <w:hyperlink r:id="rId23">
         <w:r>
           <w:rPr>
             <w:color w:val="1155cc"/>
@@ -13081,7 +13577,7 @@
           <w:szCs w:val="20"/>
         </w:rPr>
       </w:pPr>
-      <w:hyperlink r:id="rId23">
+      <w:hyperlink r:id="rId24">
         <w:r>
           <w:rPr>
             <w:color w:val="1155cc"/>
@@ -13343,12 +13839,12 @@
       </w:r>
     </w:p>
     <w:sectPr>
-      <w:headerReference r:id="rId24" w:type="default"/>
-      <w:headerReference r:id="rId25" w:type="first"/>
-      <w:headerReference r:id="rId26" w:type="even"/>
-      <w:footerReference r:id="rId27" w:type="default"/>
-      <w:footerReference r:id="rId28" w:type="first"/>
-      <w:footerReference r:id="rId29" w:type="even"/>
+      <w:headerReference r:id="rId25" w:type="default"/>
+      <w:headerReference r:id="rId26" w:type="first"/>
+      <w:headerReference r:id="rId27" w:type="even"/>
+      <w:footerReference r:id="rId28" w:type="default"/>
+      <w:footerReference r:id="rId29" w:type="first"/>
+      <w:footerReference r:id="rId30" w:type="even"/>
       <w:pgSz w:h="16838" w:w="11906" w:orient="portrait"/>
       <w:pgMar w:bottom="1134" w:top="1134" w:left="1134" w:right="1134" w:header="709" w:footer="850"/>
       <w:pgNumType w:start="1"/>
@@ -13467,8 +13963,8 @@
 
 <file path=word/commentsExtended.xml><?xml version="1.0" encoding="utf-8"?>
 <w15:commentsEx xmlns:mc="http://schemas.openxmlformats.org/markup-compatibility/2006" xmlns:o="urn:schemas-microsoft-com:office:office" xmlns:r="http://schemas.openxmlformats.org/officeDocument/2006/relationships" xmlns:m="http://schemas.openxmlformats.org/officeDocument/2006/math" xmlns:v="urn:schemas-microsoft-com:vml" xmlns:wp="http://schemas.openxmlformats.org/drawingml/2006/wordprocessingDrawing" xmlns:w10="urn:schemas-microsoft-com:office:word" xmlns:w="http://schemas.openxmlformats.org/wordprocessingml/2006/main" xmlns:wne="http://schemas.microsoft.com/office/word/2006/wordml" xmlns:sl="http://schemas.openxmlformats.org/schemaLibrary/2006/main" xmlns:a="http://schemas.openxmlformats.org/drawingml/2006/main" xmlns:pic="http://schemas.openxmlformats.org/drawingml/2006/picture" xmlns:c="http://schemas.openxmlformats.org/drawingml/2006/chart" xmlns:lc="http://schemas.openxmlformats.org/drawingml/2006/lockedCanvas" xmlns:dgm="http://schemas.openxmlformats.org/drawingml/2006/diagram" xmlns:wps="http://schemas.microsoft.com/office/word/2010/wordprocessingShape" xmlns:wpg="http://schemas.microsoft.com/office/word/2010/wordprocessingGroup" xmlns:w14="http://schemas.microsoft.com/office/word/2010/wordml" xmlns:w15="http://schemas.microsoft.com/office/word/2012/wordml">
-  <w15:commentEx w15:paraId="00000112" w15:done="0"/>
-  <w15:commentEx w15:paraId="00000113" w15:done="0"/>
+  <w15:commentEx w15:paraId="0000011C" w15:done="0"/>
+  <w15:commentEx w15:paraId="0000011D" w15:done="0"/>
 </w15:commentsEx>
 </file>
 
@@ -13737,12 +14233,12 @@
           <wp:extent cx="865287" cy="472641"/>
           <wp:effectExtent b="0" l="0" r="0" t="0"/>
           <wp:wrapSquare wrapText="bothSides" distB="152400" distT="152400" distL="152400" distR="152400"/>
-          <wp:docPr id="20" name="image6.png"/>
+          <wp:docPr id="20" name="image2.png"/>
           <a:graphic>
             <a:graphicData uri="http://schemas.openxmlformats.org/drawingml/2006/picture">
               <pic:pic>
                 <pic:nvPicPr>
-                  <pic:cNvPr id="0" name="image6.png"/>
+                  <pic:cNvPr id="0" name="image2.png"/>
                   <pic:cNvPicPr preferRelativeResize="0"/>
                 </pic:nvPicPr>
                 <pic:blipFill>
@@ -13780,12 +14276,12 @@
           <wp:extent cx="1867967" cy="1320786"/>
           <wp:effectExtent b="0" l="0" r="0" t="0"/>
           <wp:wrapSquare wrapText="bothSides" distB="152400" distT="152400" distL="152400" distR="152400"/>
-          <wp:docPr id="23" name="image2.png"/>
+          <wp:docPr id="23" name="image4.png"/>
           <a:graphic>
             <a:graphicData uri="http://schemas.openxmlformats.org/drawingml/2006/picture">
               <pic:pic>
                 <pic:nvPicPr>
-                  <pic:cNvPr id="0" name="image2.png"/>
+                  <pic:cNvPr id="0" name="image4.png"/>
                   <pic:cNvPicPr preferRelativeResize="0"/>
                 </pic:nvPicPr>
                 <pic:blipFill>
@@ -14321,6 +14817,116 @@
   <w:abstractNum w:abstractNumId="5">
     <w:lvl w:ilvl="0">
       <w:start w:val="1"/>
+      <w:numFmt w:val="lowerLetter"/>
+      <w:lvlText w:val="%1."/>
+      <w:lvlJc w:val="left"/>
+      <w:pPr>
+        <w:ind w:left="1440" w:hanging="360"/>
+      </w:pPr>
+      <w:rPr>
+        <w:u w:val="none"/>
+      </w:rPr>
+    </w:lvl>
+    <w:lvl w:ilvl="1">
+      <w:start w:val="1"/>
+      <w:numFmt w:val="lowerRoman"/>
+      <w:lvlText w:val="%2."/>
+      <w:lvlJc w:val="right"/>
+      <w:pPr>
+        <w:ind w:left="2160" w:hanging="360"/>
+      </w:pPr>
+      <w:rPr>
+        <w:u w:val="none"/>
+      </w:rPr>
+    </w:lvl>
+    <w:lvl w:ilvl="2">
+      <w:start w:val="1"/>
+      <w:numFmt w:val="decimal"/>
+      <w:lvlText w:val="%3."/>
+      <w:lvlJc w:val="left"/>
+      <w:pPr>
+        <w:ind w:left="2880" w:hanging="360"/>
+      </w:pPr>
+      <w:rPr>
+        <w:u w:val="none"/>
+      </w:rPr>
+    </w:lvl>
+    <w:lvl w:ilvl="3">
+      <w:start w:val="1"/>
+      <w:numFmt w:val="lowerLetter"/>
+      <w:lvlText w:val="%4."/>
+      <w:lvlJc w:val="left"/>
+      <w:pPr>
+        <w:ind w:left="3600" w:hanging="360"/>
+      </w:pPr>
+      <w:rPr>
+        <w:u w:val="none"/>
+      </w:rPr>
+    </w:lvl>
+    <w:lvl w:ilvl="4">
+      <w:start w:val="1"/>
+      <w:numFmt w:val="lowerRoman"/>
+      <w:lvlText w:val="%5."/>
+      <w:lvlJc w:val="right"/>
+      <w:pPr>
+        <w:ind w:left="4320" w:hanging="360"/>
+      </w:pPr>
+      <w:rPr>
+        <w:u w:val="none"/>
+      </w:rPr>
+    </w:lvl>
+    <w:lvl w:ilvl="5">
+      <w:start w:val="1"/>
+      <w:numFmt w:val="decimal"/>
+      <w:lvlText w:val="%6."/>
+      <w:lvlJc w:val="left"/>
+      <w:pPr>
+        <w:ind w:left="5040" w:hanging="360"/>
+      </w:pPr>
+      <w:rPr>
+        <w:u w:val="none"/>
+      </w:rPr>
+    </w:lvl>
+    <w:lvl w:ilvl="6">
+      <w:start w:val="1"/>
+      <w:numFmt w:val="lowerLetter"/>
+      <w:lvlText w:val="%7."/>
+      <w:lvlJc w:val="left"/>
+      <w:pPr>
+        <w:ind w:left="5760" w:hanging="360"/>
+      </w:pPr>
+      <w:rPr>
+        <w:u w:val="none"/>
+      </w:rPr>
+    </w:lvl>
+    <w:lvl w:ilvl="7">
+      <w:start w:val="1"/>
+      <w:numFmt w:val="lowerRoman"/>
+      <w:lvlText w:val="%8."/>
+      <w:lvlJc w:val="right"/>
+      <w:pPr>
+        <w:ind w:left="6480" w:hanging="360"/>
+      </w:pPr>
+      <w:rPr>
+        <w:u w:val="none"/>
+      </w:rPr>
+    </w:lvl>
+    <w:lvl w:ilvl="8">
+      <w:start w:val="1"/>
+      <w:numFmt w:val="decimal"/>
+      <w:lvlText w:val="%9."/>
+      <w:lvlJc w:val="left"/>
+      <w:pPr>
+        <w:ind w:left="7200" w:hanging="360"/>
+      </w:pPr>
+      <w:rPr>
+        <w:u w:val="none"/>
+      </w:rPr>
+    </w:lvl>
+  </w:abstractNum>
+  <w:abstractNum w:abstractNumId="6">
+    <w:lvl w:ilvl="0">
+      <w:start w:val="1"/>
       <w:numFmt w:val="decimal"/>
       <w:lvlText w:val="%1."/>
       <w:lvlJc w:val="left"/>
@@ -14428,7 +15034,7 @@
       </w:rPr>
     </w:lvl>
   </w:abstractNum>
-  <w:abstractNum w:abstractNumId="6">
+  <w:abstractNum w:abstractNumId="7">
     <w:lvl w:ilvl="0">
       <w:start w:val="1"/>
       <w:numFmt w:val="bullet"/>
@@ -14555,6 +15161,9 @@
   </w:num>
   <w:num w:numId="6">
     <w:abstractNumId w:val="6"/>
+  </w:num>
+  <w:num w:numId="7">
+    <w:abstractNumId w:val="7"/>
   </w:num>
 </w:numbering>
 </file>
@@ -15455,7 +16064,7 @@
 
 <file path=customXML/item1.xml><?xml version="1.0" encoding="utf-8"?>
 <go:gDocsCustomXmlDataStorage xmlns:go="http://customooxmlschemas.google.com/" xmlns:r="http://schemas.openxmlformats.org/officeDocument/2006/relationships">
-  <go:docsCustomData xmlns:go="http://customooxmlschemas.google.com/" roundtripDataSignature="AMtx7miW14KyuQOEA7FgA/Pac2YbGUrKMg==">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</go:docsCustomData>
+  <go:docsCustomData xmlns:go="http://customooxmlschemas.google.com/" roundtripDataSignature="AMtx7miW14KyuQOEA7FgA/Pac2YbGUrKMg==">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</go:docsCustomData>
 </go:gDocsCustomXmlDataStorage>
 </file>
 

</xml_diff>

<commit_message>
documentação com as personas e mapa do usuário
</commit_message>
<xml_diff>
--- a/Documentos/Documentação .docx
+++ b/Documentos/Documentação .docx
@@ -116,12 +116,12 @@
                 <wp:extent cx="193066" cy="199281"/>
                 <wp:effectExtent b="0" l="0" r="0" t="0"/>
                 <wp:wrapNone/>
-                <wp:docPr id="18" name="image9.png"/>
+                <wp:docPr id="18" name="image10.png"/>
                 <a:graphic>
                   <a:graphicData uri="http://schemas.openxmlformats.org/drawingml/2006/picture">
                     <pic:pic>
                       <pic:nvPicPr>
-                        <pic:cNvPr id="0" name="image9.png"/>
+                        <pic:cNvPr id="0" name="image10.png"/>
                         <pic:cNvPicPr preferRelativeResize="0"/>
                       </pic:nvPicPr>
                       <pic:blipFill>
@@ -164,12 +164,12 @@
             <wp:extent cx="8567336" cy="13559193"/>
             <wp:effectExtent b="0" l="0" r="0" t="0"/>
             <wp:wrapSquare wrapText="bothSides" distB="152400" distT="152400" distL="152400" distR="152400"/>
-            <wp:docPr id="24" name="image3.png"/>
+            <wp:docPr id="26" name="image5.png"/>
             <a:graphic>
               <a:graphicData uri="http://schemas.openxmlformats.org/drawingml/2006/picture">
                 <pic:pic>
                   <pic:nvPicPr>
-                    <pic:cNvPr id="0" name="image3.png"/>
+                    <pic:cNvPr id="0" name="image5.png"/>
                     <pic:cNvPicPr preferRelativeResize="0"/>
                   </pic:nvPicPr>
                   <pic:blipFill>
@@ -210,12 +210,12 @@
             <wp:extent cx="2804546" cy="1204657"/>
             <wp:effectExtent b="0" l="0" r="0" t="0"/>
             <wp:wrapSquare wrapText="bothSides" distB="152400" distT="152400" distL="152400" distR="152400"/>
-            <wp:docPr id="27" name="image7.png"/>
+            <wp:docPr id="30" name="image1.png"/>
             <a:graphic>
               <a:graphicData uri="http://schemas.openxmlformats.org/drawingml/2006/picture">
                 <pic:pic>
                   <pic:nvPicPr>
-                    <pic:cNvPr id="0" name="image7.png"/>
+                    <pic:cNvPr id="0" name="image1.png"/>
                     <pic:cNvPicPr preferRelativeResize="0"/>
                   </pic:nvPicPr>
                   <pic:blipFill>
@@ -357,12 +357,12 @@
                 <wp:extent cx="3931928" cy="1659082"/>
                 <wp:effectExtent b="0" l="0" r="0" t="0"/>
                 <wp:wrapTopAndBottom distB="152400" distT="152400"/>
-                <wp:docPr id="17" name="image8.png"/>
+                <wp:docPr id="17" name="image9.png"/>
                 <a:graphic>
                   <a:graphicData uri="http://schemas.openxmlformats.org/drawingml/2006/picture">
                     <pic:pic>
                       <pic:nvPicPr>
-                        <pic:cNvPr id="0" name="image8.png"/>
+                        <pic:cNvPr id="0" name="image9.png"/>
                         <pic:cNvPicPr preferRelativeResize="0"/>
                       </pic:nvPicPr>
                       <pic:blipFill>
@@ -404,12 +404,12 @@
             <wp:extent cx="865287" cy="472641"/>
             <wp:effectExtent b="0" l="0" r="0" t="0"/>
             <wp:wrapSquare wrapText="bothSides" distB="152400" distT="152400" distL="152400" distR="152400"/>
-            <wp:docPr id="26" name="image2.png"/>
+            <wp:docPr id="28" name="image7.png"/>
             <a:graphic>
               <a:graphicData uri="http://schemas.openxmlformats.org/drawingml/2006/picture">
                 <pic:pic>
                   <pic:nvPicPr>
-                    <pic:cNvPr id="0" name="image2.png"/>
+                    <pic:cNvPr id="0" name="image7.png"/>
                     <pic:cNvPicPr preferRelativeResize="0"/>
                   </pic:nvPicPr>
                   <pic:blipFill>
@@ -449,12 +449,12 @@
             <wp:extent cx="1867967" cy="1320786"/>
             <wp:effectExtent b="0" l="0" r="0" t="0"/>
             <wp:wrapSquare wrapText="bothSides" distB="152400" distT="152400" distL="152400" distR="152400"/>
-            <wp:docPr id="21" name="image4.png"/>
+            <wp:docPr id="22" name="image6.png"/>
             <a:graphic>
               <a:graphicData uri="http://schemas.openxmlformats.org/drawingml/2006/picture">
                 <pic:pic>
                   <pic:nvPicPr>
-                    <pic:cNvPr id="0" name="image4.png"/>
+                    <pic:cNvPr id="0" name="image6.png"/>
                     <pic:cNvPicPr preferRelativeResize="0"/>
                   </pic:nvPicPr>
                   <pic:blipFill>
@@ -1955,6 +1955,538 @@
                 <w:rtl w:val="0"/>
               </w:rPr>
               <w:t xml:space="preserve">Atualização da seção 4.2</w:t>
+            </w:r>
+          </w:p>
+        </w:tc>
+      </w:tr>
+      <w:tr>
+        <w:trPr>
+          <w:cantSplit w:val="0"/>
+          <w:tblHeader w:val="0"/>
+        </w:trPr>
+        <w:tc>
+          <w:tcPr>
+            <w:shd w:fill="auto" w:val="clear"/>
+            <w:tcMar>
+              <w:top w:w="100.0" w:type="dxa"/>
+              <w:left w:w="100.0" w:type="dxa"/>
+              <w:bottom w:w="100.0" w:type="dxa"/>
+              <w:right w:w="100.0" w:type="dxa"/>
+            </w:tcMar>
+          </w:tcPr>
+          <w:p>
+            <w:pPr>
+              <w:widowControl w:val="0"/>
+              <w:pBdr>
+                <w:top w:space="0" w:sz="0" w:val="nil"/>
+                <w:left w:space="0" w:sz="0" w:val="nil"/>
+                <w:bottom w:space="0" w:sz="0" w:val="nil"/>
+                <w:right w:space="0" w:sz="0" w:val="nil"/>
+                <w:between w:space="0" w:sz="0" w:val="nil"/>
+              </w:pBdr>
+              <w:tabs>
+                <w:tab w:val="left" w:pos="708"/>
+                <w:tab w:val="left" w:pos="1416"/>
+                <w:tab w:val="left" w:pos="2124"/>
+                <w:tab w:val="left" w:pos="2832"/>
+                <w:tab w:val="left" w:pos="3540"/>
+                <w:tab w:val="left" w:pos="4248"/>
+                <w:tab w:val="left" w:pos="4956"/>
+                <w:tab w:val="left" w:pos="5664"/>
+                <w:tab w:val="left" w:pos="6372"/>
+                <w:tab w:val="left" w:pos="7080"/>
+                <w:tab w:val="left" w:pos="7788"/>
+                <w:tab w:val="left" w:pos="8496"/>
+                <w:tab w:val="left" w:pos="9204"/>
+                <w:tab w:val="left" w:pos="708"/>
+                <w:tab w:val="left" w:pos="1416"/>
+                <w:tab w:val="left" w:pos="2124"/>
+                <w:tab w:val="left" w:pos="2832"/>
+                <w:tab w:val="left" w:pos="3540"/>
+                <w:tab w:val="left" w:pos="4248"/>
+                <w:tab w:val="left" w:pos="4956"/>
+                <w:tab w:val="left" w:pos="5664"/>
+                <w:tab w:val="left" w:pos="6372"/>
+                <w:tab w:val="left" w:pos="7080"/>
+                <w:tab w:val="left" w:pos="7788"/>
+                <w:tab w:val="left" w:pos="8496"/>
+                <w:tab w:val="left" w:pos="9204"/>
+              </w:tabs>
+              <w:spacing w:after="0" w:line="240" w:lineRule="auto"/>
+              <w:jc w:val="center"/>
+              <w:rPr>
+                <w:sz w:val="20"/>
+                <w:szCs w:val="20"/>
+              </w:rPr>
+            </w:pPr>
+            <w:r>
+              <w:rPr>
+                <w:sz w:val="20"/>
+                <w:szCs w:val="20"/>
+                <w:rtl w:val="0"/>
+              </w:rPr>
+              <w:t xml:space="preserve">17/08/2022</w:t>
+            </w:r>
+          </w:p>
+        </w:tc>
+        <w:tc>
+          <w:tcPr>
+            <w:shd w:fill="auto" w:val="clear"/>
+            <w:tcMar>
+              <w:top w:w="100.0" w:type="dxa"/>
+              <w:left w:w="100.0" w:type="dxa"/>
+              <w:bottom w:w="100.0" w:type="dxa"/>
+              <w:right w:w="100.0" w:type="dxa"/>
+            </w:tcMar>
+          </w:tcPr>
+          <w:p>
+            <w:pPr>
+              <w:widowControl w:val="0"/>
+              <w:pBdr>
+                <w:top w:space="0" w:sz="0" w:val="nil"/>
+                <w:left w:space="0" w:sz="0" w:val="nil"/>
+                <w:bottom w:space="0" w:sz="0" w:val="nil"/>
+                <w:right w:space="0" w:sz="0" w:val="nil"/>
+                <w:between w:space="0" w:sz="0" w:val="nil"/>
+              </w:pBdr>
+              <w:tabs>
+                <w:tab w:val="left" w:pos="708"/>
+                <w:tab w:val="left" w:pos="1416"/>
+                <w:tab w:val="left" w:pos="2124"/>
+                <w:tab w:val="left" w:pos="2832"/>
+                <w:tab w:val="left" w:pos="3540"/>
+                <w:tab w:val="left" w:pos="4248"/>
+                <w:tab w:val="left" w:pos="4956"/>
+                <w:tab w:val="left" w:pos="5664"/>
+                <w:tab w:val="left" w:pos="6372"/>
+                <w:tab w:val="left" w:pos="7080"/>
+                <w:tab w:val="left" w:pos="7788"/>
+                <w:tab w:val="left" w:pos="8496"/>
+                <w:tab w:val="left" w:pos="9204"/>
+                <w:tab w:val="left" w:pos="708"/>
+                <w:tab w:val="left" w:pos="1416"/>
+                <w:tab w:val="left" w:pos="2124"/>
+                <w:tab w:val="left" w:pos="2832"/>
+                <w:tab w:val="left" w:pos="3540"/>
+                <w:tab w:val="left" w:pos="4248"/>
+                <w:tab w:val="left" w:pos="4956"/>
+                <w:tab w:val="left" w:pos="5664"/>
+                <w:tab w:val="left" w:pos="6372"/>
+                <w:tab w:val="left" w:pos="7080"/>
+                <w:tab w:val="left" w:pos="7788"/>
+                <w:tab w:val="left" w:pos="8496"/>
+                <w:tab w:val="left" w:pos="9204"/>
+              </w:tabs>
+              <w:spacing w:after="0" w:line="240" w:lineRule="auto"/>
+              <w:jc w:val="center"/>
+              <w:rPr>
+                <w:sz w:val="20"/>
+                <w:szCs w:val="20"/>
+              </w:rPr>
+            </w:pPr>
+            <w:r>
+              <w:rPr>
+                <w:sz w:val="20"/>
+                <w:szCs w:val="20"/>
+                <w:rtl w:val="0"/>
+              </w:rPr>
+              <w:t xml:space="preserve">Raissa Sabino</w:t>
+            </w:r>
+          </w:p>
+        </w:tc>
+        <w:tc>
+          <w:tcPr>
+            <w:shd w:fill="auto" w:val="clear"/>
+            <w:tcMar>
+              <w:top w:w="100.0" w:type="dxa"/>
+              <w:left w:w="100.0" w:type="dxa"/>
+              <w:bottom w:w="100.0" w:type="dxa"/>
+              <w:right w:w="100.0" w:type="dxa"/>
+            </w:tcMar>
+          </w:tcPr>
+          <w:p>
+            <w:pPr>
+              <w:widowControl w:val="0"/>
+              <w:pBdr>
+                <w:top w:space="0" w:sz="0" w:val="nil"/>
+                <w:left w:space="0" w:sz="0" w:val="nil"/>
+                <w:bottom w:space="0" w:sz="0" w:val="nil"/>
+                <w:right w:space="0" w:sz="0" w:val="nil"/>
+                <w:between w:space="0" w:sz="0" w:val="nil"/>
+              </w:pBdr>
+              <w:tabs>
+                <w:tab w:val="left" w:pos="708"/>
+                <w:tab w:val="left" w:pos="1416"/>
+                <w:tab w:val="left" w:pos="2124"/>
+                <w:tab w:val="left" w:pos="2832"/>
+                <w:tab w:val="left" w:pos="3540"/>
+                <w:tab w:val="left" w:pos="4248"/>
+                <w:tab w:val="left" w:pos="4956"/>
+                <w:tab w:val="left" w:pos="5664"/>
+                <w:tab w:val="left" w:pos="6372"/>
+                <w:tab w:val="left" w:pos="7080"/>
+                <w:tab w:val="left" w:pos="7788"/>
+                <w:tab w:val="left" w:pos="8496"/>
+                <w:tab w:val="left" w:pos="9204"/>
+                <w:tab w:val="left" w:pos="708"/>
+                <w:tab w:val="left" w:pos="1416"/>
+                <w:tab w:val="left" w:pos="2124"/>
+                <w:tab w:val="left" w:pos="2832"/>
+                <w:tab w:val="left" w:pos="3540"/>
+                <w:tab w:val="left" w:pos="4248"/>
+                <w:tab w:val="left" w:pos="4956"/>
+                <w:tab w:val="left" w:pos="5664"/>
+                <w:tab w:val="left" w:pos="6372"/>
+                <w:tab w:val="left" w:pos="7080"/>
+                <w:tab w:val="left" w:pos="7788"/>
+                <w:tab w:val="left" w:pos="8496"/>
+                <w:tab w:val="left" w:pos="9204"/>
+              </w:tabs>
+              <w:spacing w:after="0" w:line="240" w:lineRule="auto"/>
+              <w:jc w:val="center"/>
+              <w:rPr>
+                <w:sz w:val="20"/>
+                <w:szCs w:val="20"/>
+              </w:rPr>
+            </w:pPr>
+            <w:r>
+              <w:rPr>
+                <w:sz w:val="20"/>
+                <w:szCs w:val="20"/>
+                <w:rtl w:val="0"/>
+              </w:rPr>
+              <w:t xml:space="preserve">1.4</w:t>
+            </w:r>
+          </w:p>
+        </w:tc>
+        <w:tc>
+          <w:tcPr>
+            <w:shd w:fill="auto" w:val="clear"/>
+            <w:tcMar>
+              <w:top w:w="100.0" w:type="dxa"/>
+              <w:left w:w="100.0" w:type="dxa"/>
+              <w:bottom w:w="100.0" w:type="dxa"/>
+              <w:right w:w="100.0" w:type="dxa"/>
+            </w:tcMar>
+          </w:tcPr>
+          <w:p>
+            <w:pPr>
+              <w:widowControl w:val="0"/>
+              <w:pBdr>
+                <w:top w:space="0" w:sz="0" w:val="nil"/>
+                <w:left w:space="0" w:sz="0" w:val="nil"/>
+                <w:bottom w:space="0" w:sz="0" w:val="nil"/>
+                <w:right w:space="0" w:sz="0" w:val="nil"/>
+                <w:between w:space="0" w:sz="0" w:val="nil"/>
+              </w:pBdr>
+              <w:tabs>
+                <w:tab w:val="left" w:pos="708"/>
+                <w:tab w:val="left" w:pos="1416"/>
+                <w:tab w:val="left" w:pos="2124"/>
+                <w:tab w:val="left" w:pos="2832"/>
+                <w:tab w:val="left" w:pos="3540"/>
+                <w:tab w:val="left" w:pos="4248"/>
+                <w:tab w:val="left" w:pos="4956"/>
+                <w:tab w:val="left" w:pos="5664"/>
+                <w:tab w:val="left" w:pos="6372"/>
+                <w:tab w:val="left" w:pos="7080"/>
+                <w:tab w:val="left" w:pos="7788"/>
+                <w:tab w:val="left" w:pos="8496"/>
+                <w:tab w:val="left" w:pos="9204"/>
+                <w:tab w:val="left" w:pos="708"/>
+                <w:tab w:val="left" w:pos="1416"/>
+                <w:tab w:val="left" w:pos="2124"/>
+                <w:tab w:val="left" w:pos="2832"/>
+                <w:tab w:val="left" w:pos="3540"/>
+                <w:tab w:val="left" w:pos="4248"/>
+                <w:tab w:val="left" w:pos="4956"/>
+                <w:tab w:val="left" w:pos="5664"/>
+                <w:tab w:val="left" w:pos="6372"/>
+                <w:tab w:val="left" w:pos="7080"/>
+                <w:tab w:val="left" w:pos="7788"/>
+                <w:tab w:val="left" w:pos="8496"/>
+                <w:tab w:val="left" w:pos="9204"/>
+              </w:tabs>
+              <w:spacing w:after="0" w:line="240" w:lineRule="auto"/>
+              <w:jc w:val="center"/>
+              <w:rPr>
+                <w:sz w:val="20"/>
+                <w:szCs w:val="20"/>
+              </w:rPr>
+            </w:pPr>
+            <w:r>
+              <w:rPr>
+                <w:sz w:val="20"/>
+                <w:szCs w:val="20"/>
+                <w:rtl w:val="0"/>
+              </w:rPr>
+              <w:t xml:space="preserve">Adicionando as Personas (seção 4.1.6)</w:t>
+            </w:r>
+          </w:p>
+        </w:tc>
+      </w:tr>
+      <w:tr>
+        <w:trPr>
+          <w:cantSplit w:val="0"/>
+          <w:tblHeader w:val="0"/>
+        </w:trPr>
+        <w:tc>
+          <w:tcPr>
+            <w:shd w:fill="auto" w:val="clear"/>
+            <w:tcMar>
+              <w:top w:w="100.0" w:type="dxa"/>
+              <w:left w:w="100.0" w:type="dxa"/>
+              <w:bottom w:w="100.0" w:type="dxa"/>
+              <w:right w:w="100.0" w:type="dxa"/>
+            </w:tcMar>
+          </w:tcPr>
+          <w:p>
+            <w:pPr>
+              <w:widowControl w:val="0"/>
+              <w:pBdr>
+                <w:top w:space="0" w:sz="0" w:val="nil"/>
+                <w:left w:space="0" w:sz="0" w:val="nil"/>
+                <w:bottom w:space="0" w:sz="0" w:val="nil"/>
+                <w:right w:space="0" w:sz="0" w:val="nil"/>
+                <w:between w:space="0" w:sz="0" w:val="nil"/>
+              </w:pBdr>
+              <w:tabs>
+                <w:tab w:val="left" w:pos="708"/>
+                <w:tab w:val="left" w:pos="1416"/>
+                <w:tab w:val="left" w:pos="2124"/>
+                <w:tab w:val="left" w:pos="2832"/>
+                <w:tab w:val="left" w:pos="3540"/>
+                <w:tab w:val="left" w:pos="4248"/>
+                <w:tab w:val="left" w:pos="4956"/>
+                <w:tab w:val="left" w:pos="5664"/>
+                <w:tab w:val="left" w:pos="6372"/>
+                <w:tab w:val="left" w:pos="7080"/>
+                <w:tab w:val="left" w:pos="7788"/>
+                <w:tab w:val="left" w:pos="8496"/>
+                <w:tab w:val="left" w:pos="9204"/>
+                <w:tab w:val="left" w:pos="708"/>
+                <w:tab w:val="left" w:pos="1416"/>
+                <w:tab w:val="left" w:pos="2124"/>
+                <w:tab w:val="left" w:pos="2832"/>
+                <w:tab w:val="left" w:pos="3540"/>
+                <w:tab w:val="left" w:pos="4248"/>
+                <w:tab w:val="left" w:pos="4956"/>
+                <w:tab w:val="left" w:pos="5664"/>
+                <w:tab w:val="left" w:pos="6372"/>
+                <w:tab w:val="left" w:pos="7080"/>
+                <w:tab w:val="left" w:pos="7788"/>
+                <w:tab w:val="left" w:pos="8496"/>
+                <w:tab w:val="left" w:pos="9204"/>
+              </w:tabs>
+              <w:spacing w:after="0" w:line="240" w:lineRule="auto"/>
+              <w:jc w:val="center"/>
+              <w:rPr>
+                <w:sz w:val="20"/>
+                <w:szCs w:val="20"/>
+              </w:rPr>
+            </w:pPr>
+            <w:r>
+              <w:rPr>
+                <w:sz w:val="20"/>
+                <w:szCs w:val="20"/>
+                <w:rtl w:val="0"/>
+              </w:rPr>
+              <w:t xml:space="preserve">20/08/2022</w:t>
+            </w:r>
+          </w:p>
+        </w:tc>
+        <w:tc>
+          <w:tcPr>
+            <w:shd w:fill="auto" w:val="clear"/>
+            <w:tcMar>
+              <w:top w:w="100.0" w:type="dxa"/>
+              <w:left w:w="100.0" w:type="dxa"/>
+              <w:bottom w:w="100.0" w:type="dxa"/>
+              <w:right w:w="100.0" w:type="dxa"/>
+            </w:tcMar>
+          </w:tcPr>
+          <w:p>
+            <w:pPr>
+              <w:widowControl w:val="0"/>
+              <w:pBdr>
+                <w:top w:space="0" w:sz="0" w:val="nil"/>
+                <w:left w:space="0" w:sz="0" w:val="nil"/>
+                <w:bottom w:space="0" w:sz="0" w:val="nil"/>
+                <w:right w:space="0" w:sz="0" w:val="nil"/>
+                <w:between w:space="0" w:sz="0" w:val="nil"/>
+              </w:pBdr>
+              <w:tabs>
+                <w:tab w:val="left" w:pos="708"/>
+                <w:tab w:val="left" w:pos="1416"/>
+                <w:tab w:val="left" w:pos="2124"/>
+                <w:tab w:val="left" w:pos="2832"/>
+                <w:tab w:val="left" w:pos="3540"/>
+                <w:tab w:val="left" w:pos="4248"/>
+                <w:tab w:val="left" w:pos="4956"/>
+                <w:tab w:val="left" w:pos="5664"/>
+                <w:tab w:val="left" w:pos="6372"/>
+                <w:tab w:val="left" w:pos="7080"/>
+                <w:tab w:val="left" w:pos="7788"/>
+                <w:tab w:val="left" w:pos="8496"/>
+                <w:tab w:val="left" w:pos="9204"/>
+                <w:tab w:val="left" w:pos="708"/>
+                <w:tab w:val="left" w:pos="1416"/>
+                <w:tab w:val="left" w:pos="2124"/>
+                <w:tab w:val="left" w:pos="2832"/>
+                <w:tab w:val="left" w:pos="3540"/>
+                <w:tab w:val="left" w:pos="4248"/>
+                <w:tab w:val="left" w:pos="4956"/>
+                <w:tab w:val="left" w:pos="5664"/>
+                <w:tab w:val="left" w:pos="6372"/>
+                <w:tab w:val="left" w:pos="7080"/>
+                <w:tab w:val="left" w:pos="7788"/>
+                <w:tab w:val="left" w:pos="8496"/>
+                <w:tab w:val="left" w:pos="9204"/>
+              </w:tabs>
+              <w:spacing w:after="0" w:line="240" w:lineRule="auto"/>
+              <w:jc w:val="center"/>
+              <w:rPr>
+                <w:sz w:val="20"/>
+                <w:szCs w:val="20"/>
+              </w:rPr>
+            </w:pPr>
+            <w:r>
+              <w:rPr>
+                <w:sz w:val="20"/>
+                <w:szCs w:val="20"/>
+                <w:rtl w:val="0"/>
+              </w:rPr>
+              <w:t xml:space="preserve">Sarah Ribeiro</w:t>
+            </w:r>
+          </w:p>
+        </w:tc>
+        <w:tc>
+          <w:tcPr>
+            <w:shd w:fill="auto" w:val="clear"/>
+            <w:tcMar>
+              <w:top w:w="100.0" w:type="dxa"/>
+              <w:left w:w="100.0" w:type="dxa"/>
+              <w:bottom w:w="100.0" w:type="dxa"/>
+              <w:right w:w="100.0" w:type="dxa"/>
+            </w:tcMar>
+          </w:tcPr>
+          <w:p>
+            <w:pPr>
+              <w:widowControl w:val="0"/>
+              <w:pBdr>
+                <w:top w:space="0" w:sz="0" w:val="nil"/>
+                <w:left w:space="0" w:sz="0" w:val="nil"/>
+                <w:bottom w:space="0" w:sz="0" w:val="nil"/>
+                <w:right w:space="0" w:sz="0" w:val="nil"/>
+                <w:between w:space="0" w:sz="0" w:val="nil"/>
+              </w:pBdr>
+              <w:tabs>
+                <w:tab w:val="left" w:pos="708"/>
+                <w:tab w:val="left" w:pos="1416"/>
+                <w:tab w:val="left" w:pos="2124"/>
+                <w:tab w:val="left" w:pos="2832"/>
+                <w:tab w:val="left" w:pos="3540"/>
+                <w:tab w:val="left" w:pos="4248"/>
+                <w:tab w:val="left" w:pos="4956"/>
+                <w:tab w:val="left" w:pos="5664"/>
+                <w:tab w:val="left" w:pos="6372"/>
+                <w:tab w:val="left" w:pos="7080"/>
+                <w:tab w:val="left" w:pos="7788"/>
+                <w:tab w:val="left" w:pos="8496"/>
+                <w:tab w:val="left" w:pos="9204"/>
+                <w:tab w:val="left" w:pos="708"/>
+                <w:tab w:val="left" w:pos="1416"/>
+                <w:tab w:val="left" w:pos="2124"/>
+                <w:tab w:val="left" w:pos="2832"/>
+                <w:tab w:val="left" w:pos="3540"/>
+                <w:tab w:val="left" w:pos="4248"/>
+                <w:tab w:val="left" w:pos="4956"/>
+                <w:tab w:val="left" w:pos="5664"/>
+                <w:tab w:val="left" w:pos="6372"/>
+                <w:tab w:val="left" w:pos="7080"/>
+                <w:tab w:val="left" w:pos="7788"/>
+                <w:tab w:val="left" w:pos="8496"/>
+                <w:tab w:val="left" w:pos="9204"/>
+              </w:tabs>
+              <w:spacing w:after="0" w:line="240" w:lineRule="auto"/>
+              <w:jc w:val="center"/>
+              <w:rPr>
+                <w:sz w:val="20"/>
+                <w:szCs w:val="20"/>
+              </w:rPr>
+            </w:pPr>
+            <w:r>
+              <w:rPr>
+                <w:sz w:val="20"/>
+                <w:szCs w:val="20"/>
+                <w:rtl w:val="0"/>
+              </w:rPr>
+              <w:t xml:space="preserve">1.5</w:t>
+            </w:r>
+          </w:p>
+        </w:tc>
+        <w:tc>
+          <w:tcPr>
+            <w:shd w:fill="auto" w:val="clear"/>
+            <w:tcMar>
+              <w:top w:w="100.0" w:type="dxa"/>
+              <w:left w:w="100.0" w:type="dxa"/>
+              <w:bottom w:w="100.0" w:type="dxa"/>
+              <w:right w:w="100.0" w:type="dxa"/>
+            </w:tcMar>
+          </w:tcPr>
+          <w:p>
+            <w:pPr>
+              <w:widowControl w:val="0"/>
+              <w:pBdr>
+                <w:top w:space="0" w:sz="0" w:val="nil"/>
+                <w:left w:space="0" w:sz="0" w:val="nil"/>
+                <w:bottom w:space="0" w:sz="0" w:val="nil"/>
+                <w:right w:space="0" w:sz="0" w:val="nil"/>
+                <w:between w:space="0" w:sz="0" w:val="nil"/>
+              </w:pBdr>
+              <w:tabs>
+                <w:tab w:val="left" w:pos="708"/>
+                <w:tab w:val="left" w:pos="1416"/>
+                <w:tab w:val="left" w:pos="2124"/>
+                <w:tab w:val="left" w:pos="2832"/>
+                <w:tab w:val="left" w:pos="3540"/>
+                <w:tab w:val="left" w:pos="4248"/>
+                <w:tab w:val="left" w:pos="4956"/>
+                <w:tab w:val="left" w:pos="5664"/>
+                <w:tab w:val="left" w:pos="6372"/>
+                <w:tab w:val="left" w:pos="7080"/>
+                <w:tab w:val="left" w:pos="7788"/>
+                <w:tab w:val="left" w:pos="8496"/>
+                <w:tab w:val="left" w:pos="9204"/>
+                <w:tab w:val="left" w:pos="708"/>
+                <w:tab w:val="left" w:pos="1416"/>
+                <w:tab w:val="left" w:pos="2124"/>
+                <w:tab w:val="left" w:pos="2832"/>
+                <w:tab w:val="left" w:pos="3540"/>
+                <w:tab w:val="left" w:pos="4248"/>
+                <w:tab w:val="left" w:pos="4956"/>
+                <w:tab w:val="left" w:pos="5664"/>
+                <w:tab w:val="left" w:pos="6372"/>
+                <w:tab w:val="left" w:pos="7080"/>
+                <w:tab w:val="left" w:pos="7788"/>
+                <w:tab w:val="left" w:pos="8496"/>
+                <w:tab w:val="left" w:pos="9204"/>
+              </w:tabs>
+              <w:spacing w:after="0" w:line="240" w:lineRule="auto"/>
+              <w:jc w:val="center"/>
+              <w:rPr>
+                <w:sz w:val="20"/>
+                <w:szCs w:val="20"/>
+              </w:rPr>
+            </w:pPr>
+            <w:r>
+              <w:rPr>
+                <w:sz w:val="20"/>
+                <w:szCs w:val="20"/>
+                <w:rtl w:val="0"/>
+              </w:rPr>
+              <w:t xml:space="preserve">Adicionando o mapa da Jornada do Usuário. (seção 4.1.7)</w:t>
             </w:r>
           </w:p>
         </w:tc>
@@ -6112,12 +6644,12 @@
           <wp:inline distB="114300" distT="114300" distL="114300" distR="114300">
             <wp:extent cx="4319588" cy="2617670"/>
             <wp:effectExtent b="0" l="0" r="0" t="0"/>
-            <wp:docPr id="22" name="image5.jpg"/>
+            <wp:docPr id="23" name="image3.jpg"/>
             <a:graphic>
               <a:graphicData uri="http://schemas.openxmlformats.org/drawingml/2006/picture">
                 <pic:pic>
                   <pic:nvPicPr>
-                    <pic:cNvPr id="0" name="image5.jpg"/>
+                    <pic:cNvPr id="0" name="image3.jpg"/>
                     <pic:cNvPicPr preferRelativeResize="0"/>
                   </pic:nvPicPr>
                   <pic:blipFill>
@@ -7809,12 +8341,12 @@
           <wp:inline distB="114300" distT="114300" distL="114300" distR="114300">
             <wp:extent cx="6119820" cy="3441700"/>
             <wp:effectExtent b="0" l="0" r="0" t="0"/>
-            <wp:docPr id="19" name="image6.jpg"/>
+            <wp:docPr id="19" name="image4.jpg"/>
             <a:graphic>
               <a:graphicData uri="http://schemas.openxmlformats.org/drawingml/2006/picture">
                 <pic:pic>
                   <pic:nvPicPr>
-                    <pic:cNvPr id="0" name="image6.jpg"/>
+                    <pic:cNvPr id="0" name="image4.jpg"/>
                     <pic:cNvPicPr preferRelativeResize="0"/>
                   </pic:nvPicPr>
                   <pic:blipFill>
@@ -7897,12 +8429,12 @@
           <wp:inline distB="114300" distT="114300" distL="114300" distR="114300">
             <wp:extent cx="6119820" cy="2400300"/>
             <wp:effectExtent b="0" l="0" r="0" t="0"/>
-            <wp:docPr id="25" name="image1.png"/>
+            <wp:docPr id="27" name="image2.png"/>
             <a:graphic>
               <a:graphicData uri="http://schemas.openxmlformats.org/drawingml/2006/picture">
                 <pic:pic>
                   <pic:nvPicPr>
-                    <pic:cNvPr id="0" name="image1.png"/>
+                    <pic:cNvPr id="0" name="image2.png"/>
                     <pic:cNvPicPr preferRelativeResize="0"/>
                   </pic:nvPicPr>
                   <pic:blipFill>
@@ -8026,6 +8558,44 @@
     </w:p>
     <w:p>
       <w:pPr>
+        <w:tabs>
+          <w:tab w:val="left" w:pos="708"/>
+          <w:tab w:val="left" w:pos="1416"/>
+          <w:tab w:val="left" w:pos="2124"/>
+          <w:tab w:val="left" w:pos="2832"/>
+          <w:tab w:val="left" w:pos="3540"/>
+          <w:tab w:val="left" w:pos="4248"/>
+          <w:tab w:val="left" w:pos="4956"/>
+          <w:tab w:val="left" w:pos="5664"/>
+          <w:tab w:val="left" w:pos="6372"/>
+          <w:tab w:val="left" w:pos="7080"/>
+          <w:tab w:val="left" w:pos="7788"/>
+          <w:tab w:val="left" w:pos="8496"/>
+          <w:tab w:val="left" w:pos="9204"/>
+          <w:tab w:val="left" w:pos="708"/>
+          <w:tab w:val="left" w:pos="1416"/>
+          <w:tab w:val="left" w:pos="2124"/>
+          <w:tab w:val="left" w:pos="2832"/>
+          <w:tab w:val="left" w:pos="3540"/>
+          <w:tab w:val="left" w:pos="4248"/>
+          <w:tab w:val="left" w:pos="4956"/>
+          <w:tab w:val="left" w:pos="5664"/>
+          <w:tab w:val="left" w:pos="6372"/>
+          <w:tab w:val="left" w:pos="7080"/>
+          <w:tab w:val="left" w:pos="7788"/>
+          <w:tab w:val="left" w:pos="8496"/>
+          <w:tab w:val="left" w:pos="9204"/>
+        </w:tabs>
+        <w:rPr/>
+      </w:pPr>
+      <w:r>
+        <w:rPr>
+          <w:rtl w:val="0"/>
+        </w:rPr>
+      </w:r>
+    </w:p>
+    <w:p>
+      <w:pPr>
         <w:pStyle w:val="Heading3"/>
         <w:keepNext w:val="1"/>
         <w:keepLines w:val="1"/>
@@ -8151,6 +8721,228 @@
     </w:p>
     <w:p>
       <w:pPr>
+        <w:tabs>
+          <w:tab w:val="left" w:pos="708"/>
+          <w:tab w:val="left" w:pos="1416"/>
+          <w:tab w:val="left" w:pos="2124"/>
+          <w:tab w:val="left" w:pos="2832"/>
+          <w:tab w:val="left" w:pos="3540"/>
+          <w:tab w:val="left" w:pos="4248"/>
+          <w:tab w:val="left" w:pos="4956"/>
+          <w:tab w:val="left" w:pos="5664"/>
+          <w:tab w:val="left" w:pos="6372"/>
+          <w:tab w:val="left" w:pos="7080"/>
+          <w:tab w:val="left" w:pos="7788"/>
+          <w:tab w:val="left" w:pos="8496"/>
+          <w:tab w:val="left" w:pos="9204"/>
+          <w:tab w:val="left" w:pos="708"/>
+          <w:tab w:val="left" w:pos="1416"/>
+          <w:tab w:val="left" w:pos="2124"/>
+          <w:tab w:val="left" w:pos="2832"/>
+          <w:tab w:val="left" w:pos="3540"/>
+          <w:tab w:val="left" w:pos="4248"/>
+          <w:tab w:val="left" w:pos="4956"/>
+          <w:tab w:val="left" w:pos="5664"/>
+          <w:tab w:val="left" w:pos="6372"/>
+          <w:tab w:val="left" w:pos="7080"/>
+          <w:tab w:val="left" w:pos="7788"/>
+          <w:tab w:val="left" w:pos="8496"/>
+          <w:tab w:val="left" w:pos="9204"/>
+        </w:tabs>
+        <w:rPr/>
+      </w:pPr>
+      <w:r>
+        <w:rPr>
+          <w:rtl w:val="0"/>
+        </w:rPr>
+      </w:r>
+    </w:p>
+    <w:p>
+      <w:pPr>
+        <w:tabs>
+          <w:tab w:val="left" w:pos="708"/>
+          <w:tab w:val="left" w:pos="1416"/>
+          <w:tab w:val="left" w:pos="2124"/>
+          <w:tab w:val="left" w:pos="2832"/>
+          <w:tab w:val="left" w:pos="3540"/>
+          <w:tab w:val="left" w:pos="4248"/>
+          <w:tab w:val="left" w:pos="4956"/>
+          <w:tab w:val="left" w:pos="5664"/>
+          <w:tab w:val="left" w:pos="6372"/>
+          <w:tab w:val="left" w:pos="7080"/>
+          <w:tab w:val="left" w:pos="7788"/>
+          <w:tab w:val="left" w:pos="8496"/>
+          <w:tab w:val="left" w:pos="9204"/>
+          <w:tab w:val="left" w:pos="708"/>
+          <w:tab w:val="left" w:pos="1416"/>
+          <w:tab w:val="left" w:pos="2124"/>
+          <w:tab w:val="left" w:pos="2832"/>
+          <w:tab w:val="left" w:pos="3540"/>
+          <w:tab w:val="left" w:pos="4248"/>
+          <w:tab w:val="left" w:pos="4956"/>
+          <w:tab w:val="left" w:pos="5664"/>
+          <w:tab w:val="left" w:pos="6372"/>
+          <w:tab w:val="left" w:pos="7080"/>
+          <w:tab w:val="left" w:pos="7788"/>
+          <w:tab w:val="left" w:pos="8496"/>
+          <w:tab w:val="left" w:pos="9204"/>
+        </w:tabs>
+        <w:rPr/>
+      </w:pPr>
+      <w:r>
+        <w:rPr>
+          <w:rtl w:val="0"/>
+        </w:rPr>
+      </w:r>
+    </w:p>
+    <w:p>
+      <w:pPr>
+        <w:tabs>
+          <w:tab w:val="left" w:pos="708"/>
+          <w:tab w:val="left" w:pos="1416"/>
+          <w:tab w:val="left" w:pos="2124"/>
+          <w:tab w:val="left" w:pos="2832"/>
+          <w:tab w:val="left" w:pos="3540"/>
+          <w:tab w:val="left" w:pos="4248"/>
+          <w:tab w:val="left" w:pos="4956"/>
+          <w:tab w:val="left" w:pos="5664"/>
+          <w:tab w:val="left" w:pos="6372"/>
+          <w:tab w:val="left" w:pos="7080"/>
+          <w:tab w:val="left" w:pos="7788"/>
+          <w:tab w:val="left" w:pos="8496"/>
+          <w:tab w:val="left" w:pos="9204"/>
+          <w:tab w:val="left" w:pos="708"/>
+          <w:tab w:val="left" w:pos="1416"/>
+          <w:tab w:val="left" w:pos="2124"/>
+          <w:tab w:val="left" w:pos="2832"/>
+          <w:tab w:val="left" w:pos="3540"/>
+          <w:tab w:val="left" w:pos="4248"/>
+          <w:tab w:val="left" w:pos="4956"/>
+          <w:tab w:val="left" w:pos="5664"/>
+          <w:tab w:val="left" w:pos="6372"/>
+          <w:tab w:val="left" w:pos="7080"/>
+          <w:tab w:val="left" w:pos="7788"/>
+          <w:tab w:val="left" w:pos="8496"/>
+          <w:tab w:val="left" w:pos="9204"/>
+        </w:tabs>
+        <w:rPr/>
+      </w:pPr>
+      <w:r>
+        <w:rPr/>
+        <w:drawing>
+          <wp:inline distB="114300" distT="114300" distL="114300" distR="114300">
+            <wp:extent cx="6119820" cy="3441700"/>
+            <wp:effectExtent b="0" l="0" r="0" t="0"/>
+            <wp:docPr id="20" name="image11.jpg"/>
+            <a:graphic>
+              <a:graphicData uri="http://schemas.openxmlformats.org/drawingml/2006/picture">
+                <pic:pic>
+                  <pic:nvPicPr>
+                    <pic:cNvPr id="0" name="image11.jpg"/>
+                    <pic:cNvPicPr preferRelativeResize="0"/>
+                  </pic:nvPicPr>
+                  <pic:blipFill>
+                    <a:blip r:embed="rId19"/>
+                    <a:srcRect b="0" l="0" r="0" t="0"/>
+                    <a:stretch>
+                      <a:fillRect/>
+                    </a:stretch>
+                  </pic:blipFill>
+                  <pic:spPr>
+                    <a:xfrm>
+                      <a:off x="0" y="0"/>
+                      <a:ext cx="6119820" cy="3441700"/>
+                    </a:xfrm>
+                    <a:prstGeom prst="rect"/>
+                    <a:ln/>
+                  </pic:spPr>
+                </pic:pic>
+              </a:graphicData>
+            </a:graphic>
+          </wp:inline>
+        </w:drawing>
+      </w:r>
+      <w:r>
+        <w:rPr>
+          <w:rtl w:val="0"/>
+        </w:rPr>
+      </w:r>
+    </w:p>
+    <w:p>
+      <w:pPr>
+        <w:tabs>
+          <w:tab w:val="left" w:pos="708"/>
+          <w:tab w:val="left" w:pos="1416"/>
+          <w:tab w:val="left" w:pos="2124"/>
+          <w:tab w:val="left" w:pos="2832"/>
+          <w:tab w:val="left" w:pos="3540"/>
+          <w:tab w:val="left" w:pos="4248"/>
+          <w:tab w:val="left" w:pos="4956"/>
+          <w:tab w:val="left" w:pos="5664"/>
+          <w:tab w:val="left" w:pos="6372"/>
+          <w:tab w:val="left" w:pos="7080"/>
+          <w:tab w:val="left" w:pos="7788"/>
+          <w:tab w:val="left" w:pos="8496"/>
+          <w:tab w:val="left" w:pos="9204"/>
+          <w:tab w:val="left" w:pos="708"/>
+          <w:tab w:val="left" w:pos="1416"/>
+          <w:tab w:val="left" w:pos="2124"/>
+          <w:tab w:val="left" w:pos="2832"/>
+          <w:tab w:val="left" w:pos="3540"/>
+          <w:tab w:val="left" w:pos="4248"/>
+          <w:tab w:val="left" w:pos="4956"/>
+          <w:tab w:val="left" w:pos="5664"/>
+          <w:tab w:val="left" w:pos="6372"/>
+          <w:tab w:val="left" w:pos="7080"/>
+          <w:tab w:val="left" w:pos="7788"/>
+          <w:tab w:val="left" w:pos="8496"/>
+          <w:tab w:val="left" w:pos="9204"/>
+        </w:tabs>
+        <w:rPr/>
+      </w:pPr>
+      <w:r>
+        <w:rPr/>
+        <w:drawing>
+          <wp:inline distB="114300" distT="114300" distL="114300" distR="114300">
+            <wp:extent cx="6119820" cy="3441700"/>
+            <wp:effectExtent b="0" l="0" r="0" t="0"/>
+            <wp:docPr id="29" name="image12.jpg"/>
+            <a:graphic>
+              <a:graphicData uri="http://schemas.openxmlformats.org/drawingml/2006/picture">
+                <pic:pic>
+                  <pic:nvPicPr>
+                    <pic:cNvPr id="0" name="image12.jpg"/>
+                    <pic:cNvPicPr preferRelativeResize="0"/>
+                  </pic:nvPicPr>
+                  <pic:blipFill>
+                    <a:blip r:embed="rId20"/>
+                    <a:srcRect b="0" l="0" r="0" t="0"/>
+                    <a:stretch>
+                      <a:fillRect/>
+                    </a:stretch>
+                  </pic:blipFill>
+                  <pic:spPr>
+                    <a:xfrm>
+                      <a:off x="0" y="0"/>
+                      <a:ext cx="6119820" cy="3441700"/>
+                    </a:xfrm>
+                    <a:prstGeom prst="rect"/>
+                    <a:ln/>
+                  </pic:spPr>
+                </pic:pic>
+              </a:graphicData>
+            </a:graphic>
+          </wp:inline>
+        </w:drawing>
+      </w:r>
+      <w:r>
+        <w:rPr>
+          <w:rtl w:val="0"/>
+        </w:rPr>
+      </w:r>
+    </w:p>
+    <w:p>
+      <w:pPr>
         <w:pStyle w:val="Heading3"/>
         <w:keepNext w:val="1"/>
         <w:keepLines w:val="1"/>
@@ -8305,6 +9097,41 @@
         </w:tabs>
         <w:rPr/>
       </w:pPr>
+      <w:r>
+        <w:rPr/>
+        <w:drawing>
+          <wp:inline distB="114300" distT="114300" distL="114300" distR="114300">
+            <wp:extent cx="6119820" cy="7048500"/>
+            <wp:effectExtent b="0" l="0" r="0" t="0"/>
+            <wp:docPr id="25" name="image8.png"/>
+            <a:graphic>
+              <a:graphicData uri="http://schemas.openxmlformats.org/drawingml/2006/picture">
+                <pic:pic>
+                  <pic:nvPicPr>
+                    <pic:cNvPr id="0" name="image8.png"/>
+                    <pic:cNvPicPr preferRelativeResize="0"/>
+                  </pic:nvPicPr>
+                  <pic:blipFill>
+                    <a:blip r:embed="rId21"/>
+                    <a:srcRect b="0" l="0" r="0" t="0"/>
+                    <a:stretch>
+                      <a:fillRect/>
+                    </a:stretch>
+                  </pic:blipFill>
+                  <pic:spPr>
+                    <a:xfrm>
+                      <a:off x="0" y="0"/>
+                      <a:ext cx="6119820" cy="7048500"/>
+                    </a:xfrm>
+                    <a:prstGeom prst="rect"/>
+                    <a:ln/>
+                  </pic:spPr>
+                </pic:pic>
+              </a:graphicData>
+            </a:graphic>
+          </wp:inline>
+        </w:drawing>
+      </w:r>
       <w:r>
         <w:rPr>
           <w:rtl w:val="0"/>
@@ -10028,7 +10855,7 @@
           <w:rtl w:val="0"/>
         </w:rPr>
         <w:tab/>
-        <w:t xml:space="preserve">Quando analisada a qualidade das bases de dados disponibilizadas pelo nosso cliente nos deparamos com muitas inconsistências e informações bagunçadas e sem contexto. Como também muitos dados que fogem totalmente do padrão o que causa uma certa dificuldade na análise e estudo dos mesmos.</w:t>
+        <w:t xml:space="preserve">Quando analisada a qualidade das bases de dados disponibilizadas pelo nosso cliente nos deparamos com muitas inconsistências, informações desorganizadas e sem tipificação. Como também muitos dados que fogem totalmente do padrão o que causa uma certa dificuldade na análise e estudo destes.</w:t>
       </w:r>
     </w:p>
     <w:p>
@@ -10112,7 +10939,13 @@
           <w:rtl w:val="0"/>
         </w:rPr>
         <w:tab/>
-        <w:t xml:space="preserve">Especificamente na questão de acesso, a Rappi se disponibilizou em proporcionar o máximo de informações autorizadas possíveis, porém, há certas regras internas na empresa que inviabilizam a liberação de certos dados que talvez poderiam ser de boa utilização na modelagem de nossas hipóteses.</w:t>
+        <w:t xml:space="preserve">Especificamente na questão de acesso, a Rappi se prontificou em proporcionar o máximo de informações possíveis, porém, em decorrência de regras internas da empresa,</w:t>
+      </w:r>
+      <w:r>
+        <w:rPr>
+          <w:rtl w:val="0"/>
+        </w:rPr>
+        <w:t xml:space="preserve"> dados que poderiam contribuir para a formulação de hipóteses e desenvolvimento do modelo não serão fornecidos. </w:t>
       </w:r>
     </w:p>
     <w:p>
@@ -10254,7 +11087,7 @@
           <w:rtl w:val="0"/>
         </w:rPr>
         <w:tab/>
-        <w:t xml:space="preserve">Quanto às restrições de segurança tomadas em relação ao projeto, tivemos o cuidado e a delicadeza de não publicar ou compartilhar os dados sensíveis e pessoais referentes à Rappi, priorizamos por uma conduta ética que esteja dentro da LGPD.</w:t>
+        <w:t xml:space="preserve">Quanto às restrições de segurança tomadas em relação ao projeto, tivemos o cuidado e a delicadeza de não publicar ou compartilhar os dados sensíveis e pessoais referentes à Rappi, priorizamos por uma conduta ética que esteja de acordo com a LGPD.</w:t>
       </w:r>
     </w:p>
     <w:p>
@@ -10358,7 +11191,7 @@
         </w:rPr>
         <w:t xml:space="preserve">Toda a nossa descrição estatística dos dados foi feita na plataforma Google Colab, onde nós importamos todas as bases e começamos a analisar e identificar quais seriam os atributos que mais serviram para modelagem de nosso sistema. Segue o link para acesso: </w:t>
       </w:r>
-      <w:hyperlink r:id="rId19">
+      <w:hyperlink r:id="rId22">
         <w:r>
           <w:rPr>
             <w:color w:val="1155cc"/>
@@ -10412,7 +11245,7 @@
         <w:rPr>
           <w:rtl w:val="0"/>
         </w:rPr>
-        <w:t xml:space="preserve">Nesta análise inicial feita por nosso grupo, esmiuçamos cada tabela para trazer todos os dados quantitativos que possam ser úteis para nosso sistema. Também trouxemos representações gráficas que embasam nossas primeiras hipóteses, são elas:</w:t>
+        <w:t xml:space="preserve">Nesta análise inicial, feita por nosso grupo, esmiuçamos cada tabela para trazer todos os dados quantitativos que possam ser úteis para nosso sistema. Também trouxemos representações gráficas que embasam nossas primeiras hipóteses, são elas:</w:t>
       </w:r>
     </w:p>
     <w:p>
@@ -13315,7 +14148,7 @@
           <w:szCs w:val="20"/>
         </w:rPr>
       </w:pPr>
-      <w:hyperlink r:id="rId20">
+      <w:hyperlink r:id="rId23">
         <w:r>
           <w:rPr>
             <w:color w:val="1155cc"/>
@@ -13372,7 +14205,7 @@
           <w:szCs w:val="20"/>
         </w:rPr>
       </w:pPr>
-      <w:hyperlink r:id="rId21">
+      <w:hyperlink r:id="rId24">
         <w:r>
           <w:rPr>
             <w:color w:val="1155cc"/>
@@ -13429,7 +14262,7 @@
           <w:szCs w:val="20"/>
         </w:rPr>
       </w:pPr>
-      <w:hyperlink r:id="rId22">
+      <w:hyperlink r:id="rId25">
         <w:r>
           <w:rPr>
             <w:color w:val="1155cc"/>
@@ -13489,7 +14322,7 @@
           <w:szCs w:val="20"/>
         </w:rPr>
       </w:pPr>
-      <w:hyperlink r:id="rId23">
+      <w:hyperlink r:id="rId26">
         <w:r>
           <w:rPr>
             <w:color w:val="1155cc"/>
@@ -13577,7 +14410,7 @@
           <w:szCs w:val="20"/>
         </w:rPr>
       </w:pPr>
-      <w:hyperlink r:id="rId24">
+      <w:hyperlink r:id="rId27">
         <w:r>
           <w:rPr>
             <w:color w:val="1155cc"/>
@@ -13839,12 +14672,12 @@
       </w:r>
     </w:p>
     <w:sectPr>
-      <w:headerReference r:id="rId25" w:type="default"/>
-      <w:headerReference r:id="rId26" w:type="first"/>
-      <w:headerReference r:id="rId27" w:type="even"/>
-      <w:footerReference r:id="rId28" w:type="default"/>
-      <w:footerReference r:id="rId29" w:type="first"/>
-      <w:footerReference r:id="rId30" w:type="even"/>
+      <w:headerReference r:id="rId28" w:type="default"/>
+      <w:headerReference r:id="rId29" w:type="first"/>
+      <w:headerReference r:id="rId30" w:type="even"/>
+      <w:footerReference r:id="rId31" w:type="default"/>
+      <w:footerReference r:id="rId32" w:type="first"/>
+      <w:footerReference r:id="rId33" w:type="even"/>
       <w:pgSz w:h="16838" w:w="11906" w:orient="portrait"/>
       <w:pgMar w:bottom="1134" w:top="1134" w:left="1134" w:right="1134" w:header="709" w:footer="850"/>
       <w:pgNumType w:start="1"/>
@@ -13963,8 +14796,8 @@
 
 <file path=word/commentsExtended.xml><?xml version="1.0" encoding="utf-8"?>
 <w15:commentsEx xmlns:mc="http://schemas.openxmlformats.org/markup-compatibility/2006" xmlns:o="urn:schemas-microsoft-com:office:office" xmlns:r="http://schemas.openxmlformats.org/officeDocument/2006/relationships" xmlns:m="http://schemas.openxmlformats.org/officeDocument/2006/math" xmlns:v="urn:schemas-microsoft-com:vml" xmlns:wp="http://schemas.openxmlformats.org/drawingml/2006/wordprocessingDrawing" xmlns:w10="urn:schemas-microsoft-com:office:word" xmlns:w="http://schemas.openxmlformats.org/wordprocessingml/2006/main" xmlns:wne="http://schemas.microsoft.com/office/word/2006/wordml" xmlns:sl="http://schemas.openxmlformats.org/schemaLibrary/2006/main" xmlns:a="http://schemas.openxmlformats.org/drawingml/2006/main" xmlns:pic="http://schemas.openxmlformats.org/drawingml/2006/picture" xmlns:c="http://schemas.openxmlformats.org/drawingml/2006/chart" xmlns:lc="http://schemas.openxmlformats.org/drawingml/2006/lockedCanvas" xmlns:dgm="http://schemas.openxmlformats.org/drawingml/2006/diagram" xmlns:wps="http://schemas.microsoft.com/office/word/2010/wordprocessingShape" xmlns:wpg="http://schemas.microsoft.com/office/word/2010/wordprocessingGroup" xmlns:w14="http://schemas.microsoft.com/office/word/2010/wordml" xmlns:w15="http://schemas.microsoft.com/office/word/2012/wordml">
-  <w15:commentEx w15:paraId="0000011C" w15:done="0"/>
-  <w15:commentEx w15:paraId="0000011D" w15:done="0"/>
+  <w15:commentEx w15:paraId="00000129" w15:done="0"/>
+  <w15:commentEx w15:paraId="0000012A" w15:done="0"/>
 </w15:commentsEx>
 </file>
 
@@ -14233,12 +15066,12 @@
           <wp:extent cx="865287" cy="472641"/>
           <wp:effectExtent b="0" l="0" r="0" t="0"/>
           <wp:wrapSquare wrapText="bothSides" distB="152400" distT="152400" distL="152400" distR="152400"/>
-          <wp:docPr id="20" name="image2.png"/>
+          <wp:docPr id="21" name="image7.png"/>
           <a:graphic>
             <a:graphicData uri="http://schemas.openxmlformats.org/drawingml/2006/picture">
               <pic:pic>
                 <pic:nvPicPr>
-                  <pic:cNvPr id="0" name="image2.png"/>
+                  <pic:cNvPr id="0" name="image7.png"/>
                   <pic:cNvPicPr preferRelativeResize="0"/>
                 </pic:nvPicPr>
                 <pic:blipFill>
@@ -14276,12 +15109,12 @@
           <wp:extent cx="1867967" cy="1320786"/>
           <wp:effectExtent b="0" l="0" r="0" t="0"/>
           <wp:wrapSquare wrapText="bothSides" distB="152400" distT="152400" distL="152400" distR="152400"/>
-          <wp:docPr id="23" name="image4.png"/>
+          <wp:docPr id="24" name="image6.png"/>
           <a:graphic>
             <a:graphicData uri="http://schemas.openxmlformats.org/drawingml/2006/picture">
               <pic:pic>
                 <pic:nvPicPr>
-                  <pic:cNvPr id="0" name="image4.png"/>
+                  <pic:cNvPr id="0" name="image6.png"/>
                   <pic:cNvPicPr preferRelativeResize="0"/>
                 </pic:nvPicPr>
                 <pic:blipFill>
@@ -16064,7 +16897,7 @@
 
 <file path=customXML/item1.xml><?xml version="1.0" encoding="utf-8"?>
 <go:gDocsCustomXmlDataStorage xmlns:go="http://customooxmlschemas.google.com/" xmlns:r="http://schemas.openxmlformats.org/officeDocument/2006/relationships">
-  <go:docsCustomData xmlns:go="http://customooxmlschemas.google.com/" roundtripDataSignature="AMtx7miW14KyuQOEA7FgA/Pac2YbGUrKMg==">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</go:docsCustomData>
+  <go:docsCustomData xmlns:go="http://customooxmlschemas.google.com/" roundtripDataSignature="AMtx7miW14KyuQOEA7FgA/Pac2YbGUrKMg==">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</go:docsCustomData>
 </go:gDocsCustomXmlDataStorage>
 </file>
 

</xml_diff>